<commit_message>
Documentação: cronograma, versão web, troca de pombo e teste com usuários
</commit_message>
<xml_diff>
--- a/correio-noturno/docs/Documentacao_Software_Correio_Noturno.docx
+++ b/correio-noturno/docs/Documentacao_Software_Correio_Noturno.docx
@@ -693,7 +693,7 @@
           <w:b w:val="false"/>
           <w:bCs w:val="false"/>
         </w:rPr>
-        <w:t xml:space="preserve">	15</w:t>
+        <w:t xml:space="preserve">	16</w:t>
       </w:r>
     </w:p>
     <w:p>
@@ -825,7 +825,7 @@
           <w:b/>
           <w:bCs/>
         </w:rPr>
-        <w:t xml:space="preserve">	20</w:t>
+        <w:t xml:space="preserve">	21</w:t>
       </w:r>
     </w:p>
     <w:p>
@@ -847,7 +847,7 @@
           <w:b w:val="false"/>
           <w:bCs w:val="false"/>
         </w:rPr>
-        <w:t xml:space="preserve">	20</w:t>
+        <w:t xml:space="preserve">	21</w:t>
       </w:r>
     </w:p>
     <w:p>
@@ -869,7 +869,7 @@
           <w:b w:val="false"/>
           <w:bCs w:val="false"/>
         </w:rPr>
-        <w:t xml:space="preserve">	22</w:t>
+        <w:t xml:space="preserve">	23</w:t>
       </w:r>
     </w:p>
     <w:p>
@@ -891,7 +891,7 @@
           <w:b w:val="false"/>
           <w:bCs w:val="false"/>
         </w:rPr>
-        <w:t xml:space="preserve">	23</w:t>
+        <w:t xml:space="preserve">	24</w:t>
       </w:r>
     </w:p>
     <w:p>
@@ -913,7 +913,7 @@
           <w:b/>
           <w:bCs/>
         </w:rPr>
-        <w:t xml:space="preserve">	25</w:t>
+        <w:t xml:space="preserve">	26</w:t>
       </w:r>
     </w:p>
     <w:p>
@@ -935,7 +935,7 @@
           <w:b w:val="false"/>
           <w:bCs w:val="false"/>
         </w:rPr>
-        <w:t xml:space="preserve">	25</w:t>
+        <w:t xml:space="preserve">	26</w:t>
       </w:r>
     </w:p>
     <w:p>
@@ -957,7 +957,7 @@
           <w:b w:val="false"/>
           <w:bCs w:val="false"/>
         </w:rPr>
-        <w:t xml:space="preserve">	25</w:t>
+        <w:t xml:space="preserve">	26</w:t>
       </w:r>
     </w:p>
     <w:p>
@@ -979,7 +979,7 @@
           <w:b w:val="false"/>
           <w:bCs w:val="false"/>
         </w:rPr>
-        <w:t xml:space="preserve">	26</w:t>
+        <w:t xml:space="preserve">	27</w:t>
       </w:r>
     </w:p>
     <w:p>
@@ -1001,7 +1001,7 @@
           <w:b w:val="false"/>
           <w:bCs w:val="false"/>
         </w:rPr>
-        <w:t xml:space="preserve">	26</w:t>
+        <w:t xml:space="preserve">	27</w:t>
       </w:r>
     </w:p>
     <w:p>
@@ -1023,7 +1023,7 @@
           <w:b w:val="false"/>
           <w:bCs w:val="false"/>
         </w:rPr>
-        <w:t xml:space="preserve">	27</w:t>
+        <w:t xml:space="preserve">	28</w:t>
       </w:r>
     </w:p>
     <w:p>
@@ -1045,7 +1045,7 @@
           <w:b w:val="false"/>
           <w:bCs w:val="false"/>
         </w:rPr>
-        <w:t xml:space="preserve">	27</w:t>
+        <w:t xml:space="preserve">	28</w:t>
       </w:r>
     </w:p>
     <w:p>
@@ -1067,7 +1067,7 @@
           <w:b/>
           <w:bCs/>
         </w:rPr>
-        <w:t xml:space="preserve">	32</w:t>
+        <w:t xml:space="preserve">	33</w:t>
       </w:r>
     </w:p>
     <w:p>
@@ -1089,7 +1089,7 @@
           <w:b w:val="false"/>
           <w:bCs w:val="false"/>
         </w:rPr>
-        <w:t xml:space="preserve">	32</w:t>
+        <w:t xml:space="preserve">	33</w:t>
       </w:r>
     </w:p>
     <w:p>
@@ -1111,7 +1111,7 @@
           <w:b w:val="false"/>
           <w:bCs w:val="false"/>
         </w:rPr>
-        <w:t xml:space="preserve">	32</w:t>
+        <w:t xml:space="preserve">	33</w:t>
       </w:r>
     </w:p>
     <w:p>
@@ -1133,7 +1133,29 @@
           <w:b w:val="false"/>
           <w:bCs w:val="false"/>
         </w:rPr>
-        <w:t xml:space="preserve">	33</w:t>
+        <w:t xml:space="preserve">	34</w:t>
+      </w:r>
+    </w:p>
+    <w:p>
+      <w:pPr>
+        <w:tabs>
+          <w:tab w:val="right" w:pos="9072" w:leader="dot"/>
+        </w:tabs>
+        <w:spacing w:after="0" w:line="360"/>
+      </w:pPr>
+      <w:r>
+        <w:rPr>
+          <w:b w:val="false"/>
+          <w:bCs w:val="false"/>
+        </w:rPr>
+        <w:t xml:space="preserve">6.4 Teste com usuários</w:t>
+      </w:r>
+      <w:r>
+        <w:rPr>
+          <w:b w:val="false"/>
+          <w:bCs w:val="false"/>
+        </w:rPr>
+        <w:t xml:space="preserve">	35</w:t>
       </w:r>
     </w:p>
     <w:p>
@@ -1155,7 +1177,7 @@
           <w:b/>
           <w:bCs/>
         </w:rPr>
-        <w:t xml:space="preserve">	34</w:t>
+        <w:t xml:space="preserve">	36</w:t>
       </w:r>
     </w:p>
     <w:p>
@@ -1177,7 +1199,7 @@
           <w:b w:val="false"/>
           <w:bCs w:val="false"/>
         </w:rPr>
-        <w:t xml:space="preserve">	34</w:t>
+        <w:t xml:space="preserve">	36</w:t>
       </w:r>
     </w:p>
     <w:p>
@@ -1199,7 +1221,7 @@
           <w:b w:val="false"/>
           <w:bCs w:val="false"/>
         </w:rPr>
-        <w:t xml:space="preserve">	34</w:t>
+        <w:t xml:space="preserve">	36</w:t>
       </w:r>
     </w:p>
     <w:p>
@@ -1221,7 +1243,7 @@
           <w:b w:val="false"/>
           <w:bCs w:val="false"/>
         </w:rPr>
-        <w:t xml:space="preserve">	34</w:t>
+        <w:t xml:space="preserve">	37</w:t>
       </w:r>
     </w:p>
     <w:p>
@@ -1243,7 +1265,7 @@
           <w:b/>
           <w:bCs/>
         </w:rPr>
-        <w:t xml:space="preserve">	36</w:t>
+        <w:t xml:space="preserve">	38</w:t>
       </w:r>
     </w:p>
     <w:p>
@@ -1502,7 +1524,7 @@
         <w:jc w:val="both"/>
       </w:pPr>
       <w:r>
-        <w:t xml:space="preserve">Fazem parte do escopo: um jogo para um jogador, em computador (Windows, Linux ou macOS), com quatro fases, cinco pombos jogáveis, três níveis de dificuldade, recordes e opções salvos em arquivo, e uma versão web adicional para celular com controle por toque.</w:t>
+        <w:t xml:space="preserve">Fazem parte do escopo: um jogo para um jogador, em computador (Windows, Linux ou macOS), com quatro fases, cinco pombos jogáveis, três níveis de dificuldade, recordes e opções salvos em arquivo, e uma versão web adicional para celular, com controle por toque, que pode ser colocada na tela de início como um aplicativo.</w:t>
       </w:r>
     </w:p>
     <w:p>
@@ -1532,7 +1554,7 @@
         <w:jc w:val="both"/>
       </w:pPr>
       <w:r>
-        <w:t xml:space="preserve">O capítulo 2 apresenta os requisitos do sistema, com o diagrama de casos de uso, os requisitos funcionais e não funcionais, as regras do jogo e a aplicação das heurísticas de usabilidade. O capítulo 3 descreve a metodologia ágil adotada, com o backlog de histórias de usuário e a divisão em sprints. O capítulo 4 traz a modelagem (diagramas de classes, de sequência e de estados). O capítulo 5 explica a arquitetura e as tecnologias. O capítulo 6 reúne os testes realizados e o capítulo 7 traz as considerações finais.</w:t>
+        <w:t xml:space="preserve">O capítulo 2 apresenta os requisitos do sistema, com o diagrama de casos de uso, os requisitos funcionais e não funcionais, as regras do jogo e a aplicação das heurísticas de usabilidade. O capítulo 3 descreve a metodologia ágil adotada, com o backlog de histórias de usuário e a divisão em sprints. O capítulo 4 traz a modelagem (diagramas de classes, de sequência e de estados). O capítulo 5 explica a arquitetura e as tecnologias. O capítulo 6 reúne os testes realizados, inclusive um teste com jogadores de fora do grupo, e o capítulo 7 traz as considerações finais.</w:t>
       </w:r>
     </w:p>
     <w:p>
@@ -1573,7 +1595,7 @@
         <w:t xml:space="preserve">Jogador</w:t>
       </w:r>
       <w:r>
-        <w:t xml:space="preserve">, que interage pelo teclado (ou mouse, nos menus) na versão para computador e pela tela de toque na versão web. A gravação de opções, recordes e personagens liberados acontece em arquivos locais e é feita pelo próprio sistema, sem participação de outro ator.</w:t>
+        <w:t xml:space="preserve">, que interage pelo teclado (ou pelo mouse, nos menus) na versão para computador e pela tela de toque na versão web. A gravação de opções, recordes e personagens liberados acontece em arquivos locais e é feita pelo próprio sistema, sem participação de outro ator.</w:t>
       </w:r>
     </w:p>
     <w:p>
@@ -3772,7 +3794,7 @@
                 <w:sz w:val="20"/>
                 <w:szCs w:val="20"/>
               </w:rPr>
-              <w:t xml:space="preserve">Exibir finais diferentes para vitória (um por pombo), amanhecer e falta de penas.</w:t>
+              <w:t xml:space="preserve">Ao liberar um pombo no fim de uma fase, perguntar se o jogador quer seguir com o pombo atual ou voar com o novo a partir da fase seguinte, mantendo as cartas da bolsa e ajustando as penas à diferença entre os pombos.</w:t>
             </w:r>
           </w:p>
         </w:tc>
@@ -3803,7 +3825,7 @@
                 <w:sz w:val="20"/>
                 <w:szCs w:val="20"/>
               </w:rPr>
-              <w:t xml:space="preserve">Must</w:t>
+              <w:t xml:space="preserve">Should</w:t>
             </w:r>
           </w:p>
         </w:tc>
@@ -3834,7 +3856,7 @@
                 <w:sz w:val="20"/>
                 <w:szCs w:val="20"/>
               </w:rPr>
-              <w:t xml:space="preserve">UC03</w:t>
+              <w:t xml:space="preserve">UC09</w:t>
             </w:r>
           </w:p>
         </w:tc>
@@ -3901,7 +3923,7 @@
                 <w:sz w:val="20"/>
                 <w:szCs w:val="20"/>
               </w:rPr>
-              <w:t xml:space="preserve">Exibir tela de fim com resumo da partida e as opções Jogar de novo, Trocar de pombo, Recordes e Menu principal.</w:t>
+              <w:t xml:space="preserve">Exibir finais diferentes para vitória (um por pombo), amanhecer e falta de penas.</w:t>
             </w:r>
           </w:p>
         </w:tc>
@@ -3963,7 +3985,7 @@
                 <w:sz w:val="20"/>
                 <w:szCs w:val="20"/>
               </w:rPr>
-              <w:t xml:space="preserve">UC01</w:t>
+              <w:t xml:space="preserve">UC03</w:t>
             </w:r>
           </w:p>
         </w:tc>
@@ -4030,7 +4052,7 @@
                 <w:sz w:val="20"/>
                 <w:szCs w:val="20"/>
               </w:rPr>
-              <w:t xml:space="preserve">Registrar recorde com três iniciais quando a pontuação entrar entre as cinco melhores, salvando em arquivo.</w:t>
+              <w:t xml:space="preserve">Exibir tela de fim com resumo da partida e as opções Jogar de novo, Trocar de pombo, Recordes e Menu principal.</w:t>
             </w:r>
           </w:p>
         </w:tc>
@@ -4061,7 +4083,7 @@
                 <w:sz w:val="20"/>
                 <w:szCs w:val="20"/>
               </w:rPr>
-              <w:t xml:space="preserve">Should</w:t>
+              <w:t xml:space="preserve">Must</w:t>
             </w:r>
           </w:p>
         </w:tc>
@@ -4092,7 +4114,7 @@
                 <w:sz w:val="20"/>
                 <w:szCs w:val="20"/>
               </w:rPr>
-              <w:t xml:space="preserve">UC10</w:t>
+              <w:t xml:space="preserve">UC01</w:t>
             </w:r>
           </w:p>
         </w:tc>
@@ -4159,7 +4181,7 @@
                 <w:sz w:val="20"/>
                 <w:szCs w:val="20"/>
               </w:rPr>
-              <w:t xml:space="preserve">Permitir configurar dificuldade, volume da música, volume dos efeitos, som ligado ou desligado e tela cheia, salvando as escolhas.</w:t>
+              <w:t xml:space="preserve">Registrar recorde com três iniciais quando a pontuação entrar entre as cinco melhores, salvando em arquivo.</w:t>
             </w:r>
           </w:p>
         </w:tc>
@@ -4221,7 +4243,7 @@
                 <w:sz w:val="20"/>
                 <w:szCs w:val="20"/>
               </w:rPr>
-              <w:t xml:space="preserve">UC11</w:t>
+              <w:t xml:space="preserve">UC10</w:t>
             </w:r>
           </w:p>
         </w:tc>
@@ -4288,7 +4310,7 @@
                 <w:sz w:val="20"/>
                 <w:szCs w:val="20"/>
               </w:rPr>
-              <w:t xml:space="preserve">Ligar ou desligar o som com a tecla M em qualquer tela.</w:t>
+              <w:t xml:space="preserve">Permitir configurar dificuldade, volume da música, volume dos efeitos, som ligado ou desligado e tela cheia, salvando as escolhas.</w:t>
             </w:r>
           </w:p>
         </w:tc>
@@ -4319,7 +4341,7 @@
                 <w:sz w:val="20"/>
                 <w:szCs w:val="20"/>
               </w:rPr>
-              <w:t xml:space="preserve">Must</w:t>
+              <w:t xml:space="preserve">Should</w:t>
             </w:r>
           </w:p>
         </w:tc>
@@ -4417,7 +4439,7 @@
                 <w:sz w:val="20"/>
                 <w:szCs w:val="20"/>
               </w:rPr>
-              <w:t xml:space="preserve">Exibir a tela Como jogar com controles, regras e a descrição de cada objeto da cidade.</w:t>
+              <w:t xml:space="preserve">Ligar ou desligar o som com a tecla M em qualquer tela.</w:t>
             </w:r>
           </w:p>
         </w:tc>
@@ -4479,7 +4501,7 @@
                 <w:sz w:val="20"/>
                 <w:szCs w:val="20"/>
               </w:rPr>
-              <w:t xml:space="preserve">UC12</w:t>
+              <w:t xml:space="preserve">UC11</w:t>
             </w:r>
           </w:p>
         </w:tc>
@@ -4546,7 +4568,7 @@
                 <w:sz w:val="20"/>
                 <w:szCs w:val="20"/>
               </w:rPr>
-              <w:t xml:space="preserve">Exibir a tela de recordes com nome, pontos, dificuldade e pombo usado.</w:t>
+              <w:t xml:space="preserve">Exibir a tela Como jogar com controles, regras e a descrição de cada objeto da cidade.</w:t>
             </w:r>
           </w:p>
         </w:tc>
@@ -4577,7 +4599,7 @@
                 <w:sz w:val="20"/>
                 <w:szCs w:val="20"/>
               </w:rPr>
-              <w:t xml:space="preserve">Should</w:t>
+              <w:t xml:space="preserve">Must</w:t>
             </w:r>
           </w:p>
         </w:tc>
@@ -4608,7 +4630,7 @@
                 <w:sz w:val="20"/>
                 <w:szCs w:val="20"/>
               </w:rPr>
-              <w:t xml:space="preserve">UC13</w:t>
+              <w:t xml:space="preserve">UC12</w:t>
             </w:r>
           </w:p>
         </w:tc>
@@ -4675,7 +4697,7 @@
                 <w:sz w:val="20"/>
                 <w:szCs w:val="20"/>
               </w:rPr>
-              <w:t xml:space="preserve">Exibir a tela de créditos com os integrantes e a origem dos assets.</w:t>
+              <w:t xml:space="preserve">Exibir a tela de recordes com nome, pontos, dificuldade e pombo usado.</w:t>
             </w:r>
           </w:p>
         </w:tc>
@@ -4706,7 +4728,7 @@
                 <w:sz w:val="20"/>
                 <w:szCs w:val="20"/>
               </w:rPr>
-              <w:t xml:space="preserve">Must</w:t>
+              <w:t xml:space="preserve">Should</w:t>
             </w:r>
           </w:p>
         </w:tc>
@@ -4737,7 +4759,7 @@
                 <w:sz w:val="20"/>
                 <w:szCs w:val="20"/>
               </w:rPr>
-              <w:t xml:space="preserve">UC14</w:t>
+              <w:t xml:space="preserve">UC13</w:t>
             </w:r>
           </w:p>
         </w:tc>
@@ -4804,7 +4826,7 @@
                 <w:sz w:val="20"/>
                 <w:szCs w:val="20"/>
               </w:rPr>
-              <w:t xml:space="preserve">Salvar uma captura de tela com F12.</w:t>
+              <w:t xml:space="preserve">Exibir a tela de créditos com os integrantes e a origem dos assets.</w:t>
             </w:r>
           </w:p>
         </w:tc>
@@ -4835,7 +4857,7 @@
                 <w:sz w:val="20"/>
                 <w:szCs w:val="20"/>
               </w:rPr>
-              <w:t xml:space="preserve">Could</w:t>
+              <w:t xml:space="preserve">Must</w:t>
             </w:r>
           </w:p>
         </w:tc>
@@ -4866,7 +4888,7 @@
                 <w:sz w:val="20"/>
                 <w:szCs w:val="20"/>
               </w:rPr>
-              <w:t xml:space="preserve">—</w:t>
+              <w:t xml:space="preserve">UC14</w:t>
             </w:r>
           </w:p>
         </w:tc>
@@ -4933,7 +4955,7 @@
                 <w:sz w:val="20"/>
                 <w:szCs w:val="20"/>
               </w:rPr>
-              <w:t xml:space="preserve">Disponibilizar uma versão web jogável no celular com controle por toque.</w:t>
+              <w:t xml:space="preserve">Salvar uma captura de tela com F12.</w:t>
             </w:r>
           </w:p>
         </w:tc>
@@ -4995,7 +5017,7 @@
                 <w:sz w:val="20"/>
                 <w:szCs w:val="20"/>
               </w:rPr>
-              <w:t xml:space="preserve">UC01 a UC14</w:t>
+              <w:t xml:space="preserve">—</w:t>
             </w:r>
           </w:p>
         </w:tc>
@@ -5032,6 +5054,135 @@
                 <w:szCs w:val="20"/>
               </w:rPr>
               <w:t xml:space="preserve">RF25</w:t>
+            </w:r>
+          </w:p>
+        </w:tc>
+        <w:tc>
+          <w:tcPr>
+            <w:tcW w:type="dxa" w:w="5474"/>
+            <w:tcBorders>
+              <w:top w:val="single" w:color="000000" w:sz="4"/>
+              <w:left w:val="single" w:color="000000" w:sz="4"/>
+              <w:bottom w:val="single" w:color="000000" w:sz="4"/>
+              <w:right w:val="single" w:color="000000" w:sz="4"/>
+            </w:tcBorders>
+            <w:tcMar>
+              <w:top w:type="dxa" w:w="60"/>
+              <w:left w:type="dxa" w:w="100"/>
+              <w:bottom w:type="dxa" w:w="60"/>
+              <w:right w:type="dxa" w:w="100"/>
+            </w:tcMar>
+            <w:vAlign w:val="center"/>
+          </w:tcPr>
+          <w:p>
+            <w:pPr>
+              <w:spacing w:after="20" w:line="240"/>
+              <w:jc w:val="left"/>
+            </w:pPr>
+            <w:r>
+              <w:rPr>
+                <w:sz w:val="20"/>
+                <w:szCs w:val="20"/>
+              </w:rPr>
+              <w:t xml:space="preserve">Disponibilizar uma versão web jogável no celular, com controle por toque e ícone próprio para a tela de início.</w:t>
+            </w:r>
+          </w:p>
+        </w:tc>
+        <w:tc>
+          <w:tcPr>
+            <w:tcW w:type="dxa" w:w="1251"/>
+            <w:tcBorders>
+              <w:top w:val="single" w:color="000000" w:sz="4"/>
+              <w:left w:val="single" w:color="000000" w:sz="4"/>
+              <w:bottom w:val="single" w:color="000000" w:sz="4"/>
+              <w:right w:val="single" w:color="000000" w:sz="4"/>
+            </w:tcBorders>
+            <w:tcMar>
+              <w:top w:type="dxa" w:w="60"/>
+              <w:left w:type="dxa" w:w="100"/>
+              <w:bottom w:type="dxa" w:w="60"/>
+              <w:right w:type="dxa" w:w="100"/>
+            </w:tcMar>
+            <w:vAlign w:val="center"/>
+          </w:tcPr>
+          <w:p>
+            <w:pPr>
+              <w:spacing w:after="20" w:line="240"/>
+              <w:jc w:val="center"/>
+            </w:pPr>
+            <w:r>
+              <w:rPr>
+                <w:sz w:val="20"/>
+                <w:szCs w:val="20"/>
+              </w:rPr>
+              <w:t xml:space="preserve">Could</w:t>
+            </w:r>
+          </w:p>
+        </w:tc>
+        <w:tc>
+          <w:tcPr>
+            <w:tcW w:type="dxa" w:w="1565"/>
+            <w:tcBorders>
+              <w:top w:val="single" w:color="000000" w:sz="4"/>
+              <w:left w:val="single" w:color="000000" w:sz="4"/>
+              <w:bottom w:val="single" w:color="000000" w:sz="4"/>
+              <w:right w:val="single" w:color="000000" w:sz="4"/>
+            </w:tcBorders>
+            <w:tcMar>
+              <w:top w:type="dxa" w:w="60"/>
+              <w:left w:type="dxa" w:w="100"/>
+              <w:bottom w:type="dxa" w:w="60"/>
+              <w:right w:type="dxa" w:w="100"/>
+            </w:tcMar>
+            <w:vAlign w:val="center"/>
+          </w:tcPr>
+          <w:p>
+            <w:pPr>
+              <w:spacing w:after="20" w:line="240"/>
+              <w:jc w:val="left"/>
+            </w:pPr>
+            <w:r>
+              <w:rPr>
+                <w:sz w:val="20"/>
+                <w:szCs w:val="20"/>
+              </w:rPr>
+              <w:t xml:space="preserve">UC01 a UC14</w:t>
+            </w:r>
+          </w:p>
+        </w:tc>
+      </w:tr>
+      <w:tr>
+        <w:trPr>
+          <w:cantSplit/>
+        </w:trPr>
+        <w:tc>
+          <w:tcPr>
+            <w:tcW w:type="dxa" w:w="782"/>
+            <w:tcBorders>
+              <w:top w:val="single" w:color="000000" w:sz="4"/>
+              <w:left w:val="single" w:color="000000" w:sz="4"/>
+              <w:bottom w:val="single" w:color="000000" w:sz="4"/>
+              <w:right w:val="single" w:color="000000" w:sz="4"/>
+            </w:tcBorders>
+            <w:tcMar>
+              <w:top w:type="dxa" w:w="60"/>
+              <w:left w:type="dxa" w:w="100"/>
+              <w:bottom w:type="dxa" w:w="60"/>
+              <w:right w:type="dxa" w:w="100"/>
+            </w:tcMar>
+            <w:vAlign w:val="center"/>
+          </w:tcPr>
+          <w:p>
+            <w:pPr>
+              <w:spacing w:after="20" w:line="240"/>
+              <w:jc w:val="center"/>
+            </w:pPr>
+            <w:r>
+              <w:rPr>
+                <w:sz w:val="20"/>
+                <w:szCs w:val="20"/>
+              </w:rPr>
+              <w:t xml:space="preserve">RF26</w:t>
             </w:r>
           </w:p>
         </w:tc>
@@ -6520,7 +6671,7 @@
                 <w:sz w:val="20"/>
                 <w:szCs w:val="20"/>
               </w:rPr>
-              <w:t xml:space="preserve">A1 (passo 5, UC09): concluir a fase libera o pombo ligado a ela pela primeira vez; o sistema grava o progresso e mostra a apresentação do pombo novo antes da próxima fase.</w:t>
+              <w:t xml:space="preserve">A1 (passo 5, UC09): concluir a fase libera o pombo ligado a ela pela primeira vez; o sistema grava o progresso, mostra a apresentação do pombo novo e pergunta se o jogador quer seguir com o pombo atual ou voar com o novo na fase seguinte.</w:t>
             </w:r>
           </w:p>
           <w:p>
@@ -9163,7 +9314,7 @@
                 <w:sz w:val="20"/>
                 <w:szCs w:val="20"/>
               </w:rPr>
-              <w:t xml:space="preserve">Os únicos dados salvos são as opções, os pombos liberados e as iniciais dos recordes, em arquivos locais; o jogo não usa rede.</w:t>
+              <w:t xml:space="preserve">Os únicos dados salvos são as opções, os pombos liberados e as iniciais dos recordes, em arquivos locais; a versão para computador não usa rede e a versão web só baixa a página, sem enviar dados.</w:t>
             </w:r>
           </w:p>
         </w:tc>
@@ -12566,7 +12717,7 @@
         <w:jc w:val="both"/>
       </w:pPr>
       <w:r>
-        <w:t xml:space="preserve">O grupo adotou uma versão enxuta do Scrum (SCHWABER; SUTHERLAND, 2020). Como o prazo da A3 é curto, as sprints foram de um a poucos dias, cada uma terminando com uma versão jogável do jogo. O backlog foi escrito em histórias de usuário (COHN, 2004), estimadas em pontos na sequência de Fibonacci, e cada história tem critérios de aceite que foram usados para verificar se ela estava pronta.</w:t>
+        <w:t xml:space="preserve">O grupo adotou o Scrum (SCHWABER; SUTHERLAND, 2020) com sprints de uma semana, entre 20/10/2026 e a data de entrega. Cada sprint termina com uma versão jogável, que o grupo testa antes de planejar a sprint seguinte. O backlog foi escrito em histórias de usuário (COHN, 2004), estimadas em pontos na sequência de Fibonacci, e cada história tem critérios de aceite que foram usados para verificar se ela estava pronta.</w:t>
       </w:r>
     </w:p>
     <w:p>
@@ -14407,7 +14558,7 @@
                 <w:sz w:val="20"/>
                 <w:szCs w:val="20"/>
               </w:rPr>
-              <w:t xml:space="preserve">Como jogador, quero jogar no celular.</w:t>
+              <w:t xml:space="preserve">Como grupo, queremos sprites e sons próprios para não depender de assets de terceiros.</w:t>
             </w:r>
           </w:p>
         </w:tc>
@@ -14438,7 +14589,7 @@
                 <w:sz w:val="20"/>
                 <w:szCs w:val="20"/>
               </w:rPr>
-              <w:t xml:space="preserve">8</w:t>
+              <w:t xml:space="preserve">5</w:t>
             </w:r>
           </w:p>
         </w:tc>
@@ -14469,7 +14620,7 @@
                 <w:sz w:val="20"/>
                 <w:szCs w:val="20"/>
               </w:rPr>
-              <w:t xml:space="preserve">Versão web com joystick por toque e botão de arrancada; funciona no Safari do iPhone.</w:t>
+              <w:t xml:space="preserve">Todos os PNG e WAV gerados por scripts do projeto; nenhuma fonte externa na versão pygame.</w:t>
             </w:r>
           </w:p>
         </w:tc>
@@ -14536,7 +14687,7 @@
                 <w:sz w:val="20"/>
                 <w:szCs w:val="20"/>
               </w:rPr>
-              <w:t xml:space="preserve">Como grupo, queremos sprites e sons próprios para não depender de assets de terceiros.</w:t>
+              <w:t xml:space="preserve">Como avaliador, quero um README completo para instalar e entender o jogo.</w:t>
             </w:r>
           </w:p>
         </w:tc>
@@ -14567,7 +14718,7 @@
                 <w:sz w:val="20"/>
                 <w:szCs w:val="20"/>
               </w:rPr>
-              <w:t xml:space="preserve">5</w:t>
+              <w:t xml:space="preserve">3</w:t>
             </w:r>
           </w:p>
         </w:tc>
@@ -14598,7 +14749,7 @@
                 <w:sz w:val="20"/>
                 <w:szCs w:val="20"/>
               </w:rPr>
-              <w:t xml:space="preserve">Todos os PNG e WAV gerados por scripts do projeto; nenhuma fonte externa na versão pygame.</w:t>
+              <w:t xml:space="preserve">Os dez itens obrigatórios do enunciado; instruções testadas em outro computador.</w:t>
             </w:r>
           </w:p>
         </w:tc>
@@ -14665,7 +14816,7 @@
                 <w:sz w:val="20"/>
                 <w:szCs w:val="20"/>
               </w:rPr>
-              <w:t xml:space="preserve">Como avaliador, quero um README completo para instalar e entender o jogo.</w:t>
+              <w:t xml:space="preserve">Como jogador, quero jogar no celular.</w:t>
             </w:r>
           </w:p>
         </w:tc>
@@ -14696,6 +14847,135 @@
                 <w:sz w:val="20"/>
                 <w:szCs w:val="20"/>
               </w:rPr>
+              <w:t xml:space="preserve">8</w:t>
+            </w:r>
+          </w:p>
+        </w:tc>
+        <w:tc>
+          <w:tcPr>
+            <w:tcW w:type="dxa" w:w="3559"/>
+            <w:tcBorders>
+              <w:top w:val="single" w:color="000000" w:sz="4"/>
+              <w:left w:val="single" w:color="000000" w:sz="4"/>
+              <w:bottom w:val="single" w:color="000000" w:sz="4"/>
+              <w:right w:val="single" w:color="000000" w:sz="4"/>
+            </w:tcBorders>
+            <w:tcMar>
+              <w:top w:type="dxa" w:w="60"/>
+              <w:left w:type="dxa" w:w="100"/>
+              <w:bottom w:type="dxa" w:w="60"/>
+              <w:right w:type="dxa" w:w="100"/>
+            </w:tcMar>
+            <w:vAlign w:val="center"/>
+          </w:tcPr>
+          <w:p>
+            <w:pPr>
+              <w:spacing w:after="20" w:line="240"/>
+              <w:jc w:val="left"/>
+            </w:pPr>
+            <w:r>
+              <w:rPr>
+                <w:sz w:val="20"/>
+                <w:szCs w:val="20"/>
+              </w:rPr>
+              <w:t xml:space="preserve">Versão web com joystick por toque e botão de arrancada; funciona no Safari do iPhone e pode ser colocada na tela de início com ícone próprio.</w:t>
+            </w:r>
+          </w:p>
+        </w:tc>
+      </w:tr>
+      <w:tr>
+        <w:trPr>
+          <w:cantSplit/>
+        </w:trPr>
+        <w:tc>
+          <w:tcPr>
+            <w:tcW w:type="dxa" w:w="889"/>
+            <w:tcBorders>
+              <w:top w:val="single" w:color="000000" w:sz="4"/>
+              <w:left w:val="single" w:color="000000" w:sz="4"/>
+              <w:bottom w:val="single" w:color="000000" w:sz="4"/>
+              <w:right w:val="single" w:color="000000" w:sz="4"/>
+            </w:tcBorders>
+            <w:tcMar>
+              <w:top w:type="dxa" w:w="60"/>
+              <w:left w:type="dxa" w:w="100"/>
+              <w:bottom w:type="dxa" w:w="60"/>
+              <w:right w:type="dxa" w:w="100"/>
+            </w:tcMar>
+            <w:vAlign w:val="center"/>
+          </w:tcPr>
+          <w:p>
+            <w:pPr>
+              <w:spacing w:after="20" w:line="240"/>
+              <w:jc w:val="center"/>
+            </w:pPr>
+            <w:r>
+              <w:rPr>
+                <w:sz w:val="20"/>
+                <w:szCs w:val="20"/>
+              </w:rPr>
+              <w:t xml:space="preserve">HU16</w:t>
+            </w:r>
+          </w:p>
+        </w:tc>
+        <w:tc>
+          <w:tcPr>
+            <w:tcW w:type="dxa" w:w="3735"/>
+            <w:tcBorders>
+              <w:top w:val="single" w:color="000000" w:sz="4"/>
+              <w:left w:val="single" w:color="000000" w:sz="4"/>
+              <w:bottom w:val="single" w:color="000000" w:sz="4"/>
+              <w:right w:val="single" w:color="000000" w:sz="4"/>
+            </w:tcBorders>
+            <w:tcMar>
+              <w:top w:type="dxa" w:w="60"/>
+              <w:left w:type="dxa" w:w="100"/>
+              <w:bottom w:type="dxa" w:w="60"/>
+              <w:right w:type="dxa" w:w="100"/>
+            </w:tcMar>
+            <w:vAlign w:val="center"/>
+          </w:tcPr>
+          <w:p>
+            <w:pPr>
+              <w:spacing w:after="20" w:line="240"/>
+              <w:jc w:val="left"/>
+            </w:pPr>
+            <w:r>
+              <w:rPr>
+                <w:sz w:val="20"/>
+                <w:szCs w:val="20"/>
+              </w:rPr>
+              <w:t xml:space="preserve">Como jogador, quero voar com o pombo que acabei de liberar sem precisar recomeçar a noite.</w:t>
+            </w:r>
+          </w:p>
+        </w:tc>
+        <w:tc>
+          <w:tcPr>
+            <w:tcW w:type="dxa" w:w="889"/>
+            <w:tcBorders>
+              <w:top w:val="single" w:color="000000" w:sz="4"/>
+              <w:left w:val="single" w:color="000000" w:sz="4"/>
+              <w:bottom w:val="single" w:color="000000" w:sz="4"/>
+              <w:right w:val="single" w:color="000000" w:sz="4"/>
+            </w:tcBorders>
+            <w:tcMar>
+              <w:top w:type="dxa" w:w="60"/>
+              <w:left w:type="dxa" w:w="100"/>
+              <w:bottom w:type="dxa" w:w="60"/>
+              <w:right w:type="dxa" w:w="100"/>
+            </w:tcMar>
+            <w:vAlign w:val="center"/>
+          </w:tcPr>
+          <w:p>
+            <w:pPr>
+              <w:spacing w:after="20" w:line="240"/>
+              <w:jc w:val="center"/>
+            </w:pPr>
+            <w:r>
+              <w:rPr>
+                <w:sz w:val="20"/>
+                <w:szCs w:val="20"/>
+              </w:rPr>
               <w:t xml:space="preserve">3</w:t>
             </w:r>
           </w:p>
@@ -14727,7 +15007,7 @@
                 <w:sz w:val="20"/>
                 <w:szCs w:val="20"/>
               </w:rPr>
-              <w:t xml:space="preserve">Os dez itens obrigatórios do enunciado; instruções testadas em outro computador.</w:t>
+              <w:t xml:space="preserve">Ao liberar um pombo, a tela oferece seguir ou trocar; a troca mantém as cartas e ajusta as penas; o pombo escolhido fica salvo para a próxima partida.</w:t>
             </w:r>
           </w:p>
         </w:tc>
@@ -14783,10 +15063,10 @@
         </w:tblBorders>
       </w:tblPr>
       <w:tblGrid>
-        <w:gridCol w:w="1088"/>
-        <w:gridCol w:w="1632"/>
-        <w:gridCol w:w="1814"/>
-        <w:gridCol w:w="4538"/>
+        <w:gridCol w:w="988"/>
+        <w:gridCol w:w="1796"/>
+        <w:gridCol w:w="1796"/>
+        <w:gridCol w:w="4492"/>
       </w:tblGrid>
       <w:tr>
         <w:trPr>
@@ -14795,7 +15075,7 @@
         </w:trPr>
         <w:tc>
           <w:tcPr>
-            <w:tcW w:type="dxa" w:w="1088"/>
+            <w:tcW w:type="dxa" w:w="988"/>
             <w:tcBorders>
               <w:top w:val="single" w:color="000000" w:sz="4"/>
               <w:left w:val="single" w:color="000000" w:sz="4"/>
@@ -14829,7 +15109,7 @@
         </w:tc>
         <w:tc>
           <w:tcPr>
-            <w:tcW w:type="dxa" w:w="1632"/>
+            <w:tcW w:type="dxa" w:w="1796"/>
             <w:tcBorders>
               <w:top w:val="single" w:color="000000" w:sz="4"/>
               <w:left w:val="single" w:color="000000" w:sz="4"/>
@@ -14863,7 +15143,7 @@
         </w:tc>
         <w:tc>
           <w:tcPr>
-            <w:tcW w:type="dxa" w:w="1814"/>
+            <w:tcW w:type="dxa" w:w="1796"/>
             <w:tcBorders>
               <w:top w:val="single" w:color="000000" w:sz="4"/>
               <w:left w:val="single" w:color="000000" w:sz="4"/>
@@ -14897,7 +15177,7 @@
         </w:tc>
         <w:tc>
           <w:tcPr>
-            <w:tcW w:type="dxa" w:w="4538"/>
+            <w:tcW w:type="dxa" w:w="4492"/>
             <w:tcBorders>
               <w:top w:val="single" w:color="000000" w:sz="4"/>
               <w:left w:val="single" w:color="000000" w:sz="4"/>
@@ -14936,7 +15216,7 @@
         </w:trPr>
         <w:tc>
           <w:tcPr>
-            <w:tcW w:type="dxa" w:w="1088"/>
+            <w:tcW w:type="dxa" w:w="988"/>
             <w:tcBorders>
               <w:top w:val="single" w:color="000000" w:sz="4"/>
               <w:left w:val="single" w:color="000000" w:sz="4"/>
@@ -14967,7 +15247,7 @@
         </w:tc>
         <w:tc>
           <w:tcPr>
-            <w:tcW w:type="dxa" w:w="1632"/>
+            <w:tcW w:type="dxa" w:w="1796"/>
             <w:tcBorders>
               <w:top w:val="single" w:color="000000" w:sz="4"/>
               <w:left w:val="single" w:color="000000" w:sz="4"/>
@@ -14992,69 +15272,69 @@
                 <w:sz w:val="20"/>
                 <w:szCs w:val="20"/>
               </w:rPr>
-              <w:t xml:space="preserve">20/10/2026</w:t>
-            </w:r>
-          </w:p>
-        </w:tc>
-        <w:tc>
-          <w:tcPr>
-            <w:tcW w:type="dxa" w:w="1814"/>
-            <w:tcBorders>
-              <w:top w:val="single" w:color="000000" w:sz="4"/>
-              <w:left w:val="single" w:color="000000" w:sz="4"/>
-              <w:bottom w:val="single" w:color="000000" w:sz="4"/>
-              <w:right w:val="single" w:color="000000" w:sz="4"/>
-            </w:tcBorders>
-            <w:tcMar>
-              <w:top w:type="dxa" w:w="60"/>
-              <w:left w:type="dxa" w:w="100"/>
-              <w:bottom w:type="dxa" w:w="60"/>
-              <w:right w:type="dxa" w:w="100"/>
-            </w:tcMar>
-            <w:vAlign w:val="center"/>
-          </w:tcPr>
-          <w:p>
-            <w:pPr>
-              <w:spacing w:after="20" w:line="240"/>
-              <w:jc w:val="left"/>
-            </w:pPr>
-            <w:r>
-              <w:rPr>
-                <w:sz w:val="20"/>
-                <w:szCs w:val="20"/>
-              </w:rPr>
-              <w:t xml:space="preserve">HU01 a HU11, HU14</w:t>
-            </w:r>
-          </w:p>
-        </w:tc>
-        <w:tc>
-          <w:tcPr>
-            <w:tcW w:type="dxa" w:w="4538"/>
-            <w:tcBorders>
-              <w:top w:val="single" w:color="000000" w:sz="4"/>
-              <w:left w:val="single" w:color="000000" w:sz="4"/>
-              <w:bottom w:val="single" w:color="000000" w:sz="4"/>
-              <w:right w:val="single" w:color="000000" w:sz="4"/>
-            </w:tcBorders>
-            <w:tcMar>
-              <w:top w:type="dxa" w:w="60"/>
-              <w:left w:type="dxa" w:w="100"/>
-              <w:bottom w:type="dxa" w:w="60"/>
-              <w:right w:type="dxa" w:w="100"/>
-            </w:tcMar>
-            <w:vAlign w:val="center"/>
-          </w:tcPr>
-          <w:p>
-            <w:pPr>
-              <w:spacing w:after="20" w:line="240"/>
-              <w:jc w:val="left"/>
-            </w:pPr>
-            <w:r>
-              <w:rPr>
-                <w:sz w:val="20"/>
-                <w:szCs w:val="20"/>
-              </w:rPr>
-              <w:t xml:space="preserve">Jogo completo em pygame: menu, história, quatro fases, inimigos, power-ups, finais, recordes, opções, sprites e sons.</w:t>
+              <w:t xml:space="preserve">20/10 a 26/10/2026</w:t>
+            </w:r>
+          </w:p>
+        </w:tc>
+        <w:tc>
+          <w:tcPr>
+            <w:tcW w:type="dxa" w:w="1796"/>
+            <w:tcBorders>
+              <w:top w:val="single" w:color="000000" w:sz="4"/>
+              <w:left w:val="single" w:color="000000" w:sz="4"/>
+              <w:bottom w:val="single" w:color="000000" w:sz="4"/>
+              <w:right w:val="single" w:color="000000" w:sz="4"/>
+            </w:tcBorders>
+            <w:tcMar>
+              <w:top w:type="dxa" w:w="60"/>
+              <w:left w:type="dxa" w:w="100"/>
+              <w:bottom w:type="dxa" w:w="60"/>
+              <w:right w:type="dxa" w:w="100"/>
+            </w:tcMar>
+            <w:vAlign w:val="center"/>
+          </w:tcPr>
+          <w:p>
+            <w:pPr>
+              <w:spacing w:after="20" w:line="240"/>
+              <w:jc w:val="left"/>
+            </w:pPr>
+            <w:r>
+              <w:rPr>
+                <w:sz w:val="20"/>
+                <w:szCs w:val="20"/>
+              </w:rPr>
+              <w:t xml:space="preserve">HU02, HU03, HU04, HU13</w:t>
+            </w:r>
+          </w:p>
+        </w:tc>
+        <w:tc>
+          <w:tcPr>
+            <w:tcW w:type="dxa" w:w="4492"/>
+            <w:tcBorders>
+              <w:top w:val="single" w:color="000000" w:sz="4"/>
+              <w:left w:val="single" w:color="000000" w:sz="4"/>
+              <w:bottom w:val="single" w:color="000000" w:sz="4"/>
+              <w:right w:val="single" w:color="000000" w:sz="4"/>
+            </w:tcBorders>
+            <w:tcMar>
+              <w:top w:type="dxa" w:w="60"/>
+              <w:left w:type="dxa" w:w="100"/>
+              <w:bottom w:type="dxa" w:w="60"/>
+              <w:right w:type="dxa" w:w="100"/>
+            </w:tcMar>
+            <w:vAlign w:val="center"/>
+          </w:tcPr>
+          <w:p>
+            <w:pPr>
+              <w:spacing w:after="20" w:line="240"/>
+              <w:jc w:val="left"/>
+            </w:pPr>
+            <w:r>
+              <w:rPr>
+                <w:sz w:val="20"/>
+                <w:szCs w:val="20"/>
+              </w:rPr>
+              <w:t xml:space="preserve">Laço do jogo, controle do pombo, coleta e entrega de cartas, HUD, primeiros sprites e sons.</w:t>
             </w:r>
           </w:p>
         </w:tc>
@@ -15065,7 +15345,7 @@
         </w:trPr>
         <w:tc>
           <w:tcPr>
-            <w:tcW w:type="dxa" w:w="1088"/>
+            <w:tcW w:type="dxa" w:w="988"/>
             <w:tcBorders>
               <w:top w:val="single" w:color="000000" w:sz="4"/>
               <w:left w:val="single" w:color="000000" w:sz="4"/>
@@ -15096,7 +15376,7 @@
         </w:tc>
         <w:tc>
           <w:tcPr>
-            <w:tcW w:type="dxa" w:w="1632"/>
+            <w:tcW w:type="dxa" w:w="1796"/>
             <w:tcBorders>
               <w:top w:val="single" w:color="000000" w:sz="4"/>
               <w:left w:val="single" w:color="000000" w:sz="4"/>
@@ -15121,69 +15401,69 @@
                 <w:sz w:val="20"/>
                 <w:szCs w:val="20"/>
               </w:rPr>
-              <w:t xml:space="preserve">20/10/2026</w:t>
-            </w:r>
-          </w:p>
-        </w:tc>
-        <w:tc>
-          <w:tcPr>
-            <w:tcW w:type="dxa" w:w="1814"/>
-            <w:tcBorders>
-              <w:top w:val="single" w:color="000000" w:sz="4"/>
-              <w:left w:val="single" w:color="000000" w:sz="4"/>
-              <w:bottom w:val="single" w:color="000000" w:sz="4"/>
-              <w:right w:val="single" w:color="000000" w:sz="4"/>
-            </w:tcBorders>
-            <w:tcMar>
-              <w:top w:type="dxa" w:w="60"/>
-              <w:left w:type="dxa" w:w="100"/>
-              <w:bottom w:type="dxa" w:w="60"/>
-              <w:right w:type="dxa" w:w="100"/>
-            </w:tcMar>
-            <w:vAlign w:val="center"/>
-          </w:tcPr>
-          <w:p>
-            <w:pPr>
-              <w:spacing w:after="20" w:line="240"/>
-              <w:jc w:val="left"/>
-            </w:pPr>
-            <w:r>
-              <w:rPr>
-                <w:sz w:val="20"/>
-                <w:szCs w:val="20"/>
-              </w:rPr>
-              <w:t xml:space="preserve">HU13, HU15</w:t>
-            </w:r>
-          </w:p>
-        </w:tc>
-        <w:tc>
-          <w:tcPr>
-            <w:tcW w:type="dxa" w:w="4538"/>
-            <w:tcBorders>
-              <w:top w:val="single" w:color="000000" w:sz="4"/>
-              <w:left w:val="single" w:color="000000" w:sz="4"/>
-              <w:bottom w:val="single" w:color="000000" w:sz="4"/>
-              <w:right w:val="single" w:color="000000" w:sz="4"/>
-            </w:tcBorders>
-            <w:tcMar>
-              <w:top w:type="dxa" w:w="60"/>
-              <w:left w:type="dxa" w:w="100"/>
-              <w:bottom w:type="dxa" w:w="60"/>
-              <w:right w:type="dxa" w:w="100"/>
-            </w:tcMar>
-            <w:vAlign w:val="center"/>
-          </w:tcPr>
-          <w:p>
-            <w:pPr>
-              <w:spacing w:after="20" w:line="240"/>
-              <w:jc w:val="left"/>
-            </w:pPr>
-            <w:r>
-              <w:rPr>
-                <w:sz w:val="20"/>
-                <w:szCs w:val="20"/>
-              </w:rPr>
-              <w:t xml:space="preserve">Testes automatizados com partidas inteiras, ajuste de dificuldade, README com capturas e versão web para celular.</w:t>
+              <w:t xml:space="preserve">27/10 a 02/11/2026</w:t>
+            </w:r>
+          </w:p>
+        </w:tc>
+        <w:tc>
+          <w:tcPr>
+            <w:tcW w:type="dxa" w:w="1796"/>
+            <w:tcBorders>
+              <w:top w:val="single" w:color="000000" w:sz="4"/>
+              <w:left w:val="single" w:color="000000" w:sz="4"/>
+              <w:bottom w:val="single" w:color="000000" w:sz="4"/>
+              <w:right w:val="single" w:color="000000" w:sz="4"/>
+            </w:tcBorders>
+            <w:tcMar>
+              <w:top w:type="dxa" w:w="60"/>
+              <w:left w:type="dxa" w:w="100"/>
+              <w:bottom w:type="dxa" w:w="60"/>
+              <w:right w:type="dxa" w:w="100"/>
+            </w:tcMar>
+            <w:vAlign w:val="center"/>
+          </w:tcPr>
+          <w:p>
+            <w:pPr>
+              <w:spacing w:after="20" w:line="240"/>
+              <w:jc w:val="left"/>
+            </w:pPr>
+            <w:r>
+              <w:rPr>
+                <w:sz w:val="20"/>
+                <w:szCs w:val="20"/>
+              </w:rPr>
+              <w:t xml:space="preserve">HU05, HU06, HU07, HU08</w:t>
+            </w:r>
+          </w:p>
+        </w:tc>
+        <w:tc>
+          <w:tcPr>
+            <w:tcW w:type="dxa" w:w="4492"/>
+            <w:tcBorders>
+              <w:top w:val="single" w:color="000000" w:sz="4"/>
+              <w:left w:val="single" w:color="000000" w:sz="4"/>
+              <w:bottom w:val="single" w:color="000000" w:sz="4"/>
+              <w:right w:val="single" w:color="000000" w:sz="4"/>
+            </w:tcBorders>
+            <w:tcMar>
+              <w:top w:type="dxa" w:w="60"/>
+              <w:left w:type="dxa" w:w="100"/>
+              <w:bottom w:type="dxa" w:w="60"/>
+              <w:right w:type="dxa" w:w="100"/>
+            </w:tcMar>
+            <w:vAlign w:val="center"/>
+          </w:tcPr>
+          <w:p>
+            <w:pPr>
+              <w:spacing w:after="20" w:line="240"/>
+              <w:jc w:val="left"/>
+            </w:pPr>
+            <w:r>
+              <w:rPr>
+                <w:sz w:val="20"/>
+                <w:szCs w:val="20"/>
+              </w:rPr>
+              <w:t xml:space="preserve">Gatos, fios e corvos com avisos, quatro fases com vento e neblina, power-ups, pausa e reinício.</w:t>
             </w:r>
           </w:p>
         </w:tc>
@@ -15194,7 +15474,7 @@
         </w:trPr>
         <w:tc>
           <w:tcPr>
-            <w:tcW w:type="dxa" w:w="1088"/>
+            <w:tcW w:type="dxa" w:w="988"/>
             <w:tcBorders>
               <w:top w:val="single" w:color="000000" w:sz="4"/>
               <w:left w:val="single" w:color="000000" w:sz="4"/>
@@ -15225,7 +15505,7 @@
         </w:tc>
         <w:tc>
           <w:tcPr>
-            <w:tcW w:type="dxa" w:w="1632"/>
+            <w:tcW w:type="dxa" w:w="1796"/>
             <w:tcBorders>
               <w:top w:val="single" w:color="000000" w:sz="4"/>
               <w:left w:val="single" w:color="000000" w:sz="4"/>
@@ -15250,69 +15530,69 @@
                 <w:sz w:val="20"/>
                 <w:szCs w:val="20"/>
               </w:rPr>
-              <w:t xml:space="preserve">22/10/2026</w:t>
-            </w:r>
-          </w:p>
-        </w:tc>
-        <w:tc>
-          <w:tcPr>
-            <w:tcW w:type="dxa" w:w="1814"/>
-            <w:tcBorders>
-              <w:top w:val="single" w:color="000000" w:sz="4"/>
-              <w:left w:val="single" w:color="000000" w:sz="4"/>
-              <w:bottom w:val="single" w:color="000000" w:sz="4"/>
-              <w:right w:val="single" w:color="000000" w:sz="4"/>
-            </w:tcBorders>
-            <w:tcMar>
-              <w:top w:type="dxa" w:w="60"/>
-              <w:left w:type="dxa" w:w="100"/>
-              <w:bottom w:type="dxa" w:w="60"/>
-              <w:right w:type="dxa" w:w="100"/>
-            </w:tcMar>
-            <w:vAlign w:val="center"/>
-          </w:tcPr>
-          <w:p>
-            <w:pPr>
-              <w:spacing w:after="20" w:line="240"/>
-              <w:jc w:val="left"/>
-            </w:pPr>
-            <w:r>
-              <w:rPr>
-                <w:sz w:val="20"/>
-                <w:szCs w:val="20"/>
-              </w:rPr>
-              <w:t xml:space="preserve">HU12</w:t>
-            </w:r>
-          </w:p>
-        </w:tc>
-        <w:tc>
-          <w:tcPr>
-            <w:tcW w:type="dxa" w:w="4538"/>
-            <w:tcBorders>
-              <w:top w:val="single" w:color="000000" w:sz="4"/>
-              <w:left w:val="single" w:color="000000" w:sz="4"/>
-              <w:bottom w:val="single" w:color="000000" w:sz="4"/>
-              <w:right w:val="single" w:color="000000" w:sz="4"/>
-            </w:tcBorders>
-            <w:tcMar>
-              <w:top w:type="dxa" w:w="60"/>
-              <w:left w:type="dxa" w:w="100"/>
-              <w:bottom w:type="dxa" w:w="60"/>
-              <w:right w:type="dxa" w:w="100"/>
-            </w:tcMar>
-            <w:vAlign w:val="center"/>
-          </w:tcPr>
-          <w:p>
-            <w:pPr>
-              <w:spacing w:after="20" w:line="240"/>
-              <w:jc w:val="left"/>
-            </w:pPr>
-            <w:r>
-              <w:rPr>
-                <w:sz w:val="20"/>
-                <w:szCs w:val="20"/>
-              </w:rPr>
-              <w:t xml:space="preserve">Cinco pombos jogáveis, tela de seleção, desbloqueio por fase e nova história com finais por personagem.</w:t>
+              <w:t xml:space="preserve">03/11 a 09/11/2026</w:t>
+            </w:r>
+          </w:p>
+        </w:tc>
+        <w:tc>
+          <w:tcPr>
+            <w:tcW w:type="dxa" w:w="1796"/>
+            <w:tcBorders>
+              <w:top w:val="single" w:color="000000" w:sz="4"/>
+              <w:left w:val="single" w:color="000000" w:sz="4"/>
+              <w:bottom w:val="single" w:color="000000" w:sz="4"/>
+              <w:right w:val="single" w:color="000000" w:sz="4"/>
+            </w:tcBorders>
+            <w:tcMar>
+              <w:top w:type="dxa" w:w="60"/>
+              <w:left w:type="dxa" w:w="100"/>
+              <w:bottom w:type="dxa" w:w="60"/>
+              <w:right w:type="dxa" w:w="100"/>
+            </w:tcMar>
+            <w:vAlign w:val="center"/>
+          </w:tcPr>
+          <w:p>
+            <w:pPr>
+              <w:spacing w:after="20" w:line="240"/>
+              <w:jc w:val="left"/>
+            </w:pPr>
+            <w:r>
+              <w:rPr>
+                <w:sz w:val="20"/>
+                <w:szCs w:val="20"/>
+              </w:rPr>
+              <w:t xml:space="preserve">HU01, HU09, HU12</w:t>
+            </w:r>
+          </w:p>
+        </w:tc>
+        <w:tc>
+          <w:tcPr>
+            <w:tcW w:type="dxa" w:w="4492"/>
+            <w:tcBorders>
+              <w:top w:val="single" w:color="000000" w:sz="4"/>
+              <w:left w:val="single" w:color="000000" w:sz="4"/>
+              <w:bottom w:val="single" w:color="000000" w:sz="4"/>
+              <w:right w:val="single" w:color="000000" w:sz="4"/>
+            </w:tcBorders>
+            <w:tcMar>
+              <w:top w:type="dxa" w:w="60"/>
+              <w:left w:type="dxa" w:w="100"/>
+              <w:bottom w:type="dxa" w:w="60"/>
+              <w:right w:type="dxa" w:w="100"/>
+            </w:tcMar>
+            <w:vAlign w:val="center"/>
+          </w:tcPr>
+          <w:p>
+            <w:pPr>
+              <w:spacing w:after="20" w:line="240"/>
+              <w:jc w:val="left"/>
+            </w:pPr>
+            <w:r>
+              <w:rPr>
+                <w:sz w:val="20"/>
+                <w:szCs w:val="20"/>
+              </w:rPr>
+              <w:t xml:space="preserve">Introdução, falas entre fases, finais, cinco pombos jogáveis, tela de seleção e desbloqueio por fase.</w:t>
             </w:r>
           </w:p>
         </w:tc>
@@ -15323,7 +15603,7 @@
         </w:trPr>
         <w:tc>
           <w:tcPr>
-            <w:tcW w:type="dxa" w:w="1088"/>
+            <w:tcW w:type="dxa" w:w="988"/>
             <w:tcBorders>
               <w:top w:val="single" w:color="000000" w:sz="4"/>
               <w:left w:val="single" w:color="000000" w:sz="4"/>
@@ -15354,7 +15634,7 @@
         </w:tc>
         <w:tc>
           <w:tcPr>
-            <w:tcW w:type="dxa" w:w="1632"/>
+            <w:tcW w:type="dxa" w:w="1796"/>
             <w:tcBorders>
               <w:top w:val="single" w:color="000000" w:sz="4"/>
               <w:left w:val="single" w:color="000000" w:sz="4"/>
@@ -15379,69 +15659,198 @@
                 <w:sz w:val="20"/>
                 <w:szCs w:val="20"/>
               </w:rPr>
-              <w:t xml:space="preserve">23/10/2026 até a entrega</w:t>
-            </w:r>
-          </w:p>
-        </w:tc>
-        <w:tc>
-          <w:tcPr>
-            <w:tcW w:type="dxa" w:w="1814"/>
-            <w:tcBorders>
-              <w:top w:val="single" w:color="000000" w:sz="4"/>
-              <w:left w:val="single" w:color="000000" w:sz="4"/>
-              <w:bottom w:val="single" w:color="000000" w:sz="4"/>
-              <w:right w:val="single" w:color="000000" w:sz="4"/>
-            </w:tcBorders>
-            <w:tcMar>
-              <w:top w:type="dxa" w:w="60"/>
-              <w:left w:type="dxa" w:w="100"/>
-              <w:bottom w:type="dxa" w:w="60"/>
-              <w:right w:type="dxa" w:w="100"/>
-            </w:tcMar>
-            <w:vAlign w:val="center"/>
-          </w:tcPr>
-          <w:p>
-            <w:pPr>
-              <w:spacing w:after="20" w:line="240"/>
-              <w:jc w:val="left"/>
-            </w:pPr>
-            <w:r>
-              <w:rPr>
-                <w:sz w:val="20"/>
-                <w:szCs w:val="20"/>
-              </w:rPr>
-              <w:t xml:space="preserve">—</w:t>
-            </w:r>
-          </w:p>
-        </w:tc>
-        <w:tc>
-          <w:tcPr>
-            <w:tcW w:type="dxa" w:w="4538"/>
-            <w:tcBorders>
-              <w:top w:val="single" w:color="000000" w:sz="4"/>
-              <w:left w:val="single" w:color="000000" w:sz="4"/>
-              <w:bottom w:val="single" w:color="000000" w:sz="4"/>
-              <w:right w:val="single" w:color="000000" w:sz="4"/>
-            </w:tcBorders>
-            <w:tcMar>
-              <w:top w:type="dxa" w:w="60"/>
-              <w:left w:type="dxa" w:w="100"/>
-              <w:bottom w:type="dxa" w:w="60"/>
-              <w:right w:type="dxa" w:w="100"/>
-            </w:tcMar>
-            <w:vAlign w:val="center"/>
-          </w:tcPr>
-          <w:p>
-            <w:pPr>
-              <w:spacing w:after="20" w:line="240"/>
-              <w:jc w:val="left"/>
-            </w:pPr>
-            <w:r>
-              <w:rPr>
-                <w:sz w:val="20"/>
-                <w:szCs w:val="20"/>
-              </w:rPr>
-              <w:t xml:space="preserve">Documentação de software, publicação no GitHub e ensaio da apresentação.</w:t>
+              <w:t xml:space="preserve">10/11 a 16/11/2026</w:t>
+            </w:r>
+          </w:p>
+        </w:tc>
+        <w:tc>
+          <w:tcPr>
+            <w:tcW w:type="dxa" w:w="1796"/>
+            <w:tcBorders>
+              <w:top w:val="single" w:color="000000" w:sz="4"/>
+              <w:left w:val="single" w:color="000000" w:sz="4"/>
+              <w:bottom w:val="single" w:color="000000" w:sz="4"/>
+              <w:right w:val="single" w:color="000000" w:sz="4"/>
+            </w:tcBorders>
+            <w:tcMar>
+              <w:top w:type="dxa" w:w="60"/>
+              <w:left w:type="dxa" w:w="100"/>
+              <w:bottom w:type="dxa" w:w="60"/>
+              <w:right w:type="dxa" w:w="100"/>
+            </w:tcMar>
+            <w:vAlign w:val="center"/>
+          </w:tcPr>
+          <w:p>
+            <w:pPr>
+              <w:spacing w:after="20" w:line="240"/>
+              <w:jc w:val="left"/>
+            </w:pPr>
+            <w:r>
+              <w:rPr>
+                <w:sz w:val="20"/>
+                <w:szCs w:val="20"/>
+              </w:rPr>
+              <w:t xml:space="preserve">HU10, HU11, HU15</w:t>
+            </w:r>
+          </w:p>
+        </w:tc>
+        <w:tc>
+          <w:tcPr>
+            <w:tcW w:type="dxa" w:w="4492"/>
+            <w:tcBorders>
+              <w:top w:val="single" w:color="000000" w:sz="4"/>
+              <w:left w:val="single" w:color="000000" w:sz="4"/>
+              <w:bottom w:val="single" w:color="000000" w:sz="4"/>
+              <w:right w:val="single" w:color="000000" w:sz="4"/>
+            </w:tcBorders>
+            <w:tcMar>
+              <w:top w:type="dxa" w:w="60"/>
+              <w:left w:type="dxa" w:w="100"/>
+              <w:bottom w:type="dxa" w:w="60"/>
+              <w:right w:type="dxa" w:w="100"/>
+            </w:tcMar>
+            <w:vAlign w:val="center"/>
+          </w:tcPr>
+          <w:p>
+            <w:pPr>
+              <w:spacing w:after="20" w:line="240"/>
+              <w:jc w:val="left"/>
+            </w:pPr>
+            <w:r>
+              <w:rPr>
+                <w:sz w:val="20"/>
+                <w:szCs w:val="20"/>
+              </w:rPr>
+              <w:t xml:space="preserve">Recordes, opções de dificuldade e som, testes automatizados com partidas inteiras e versão web para celular.</w:t>
+            </w:r>
+          </w:p>
+        </w:tc>
+      </w:tr>
+      <w:tr>
+        <w:trPr>
+          <w:cantSplit/>
+        </w:trPr>
+        <w:tc>
+          <w:tcPr>
+            <w:tcW w:type="dxa" w:w="988"/>
+            <w:tcBorders>
+              <w:top w:val="single" w:color="000000" w:sz="4"/>
+              <w:left w:val="single" w:color="000000" w:sz="4"/>
+              <w:bottom w:val="single" w:color="000000" w:sz="4"/>
+              <w:right w:val="single" w:color="000000" w:sz="4"/>
+            </w:tcBorders>
+            <w:tcMar>
+              <w:top w:type="dxa" w:w="60"/>
+              <w:left w:type="dxa" w:w="100"/>
+              <w:bottom w:type="dxa" w:w="60"/>
+              <w:right w:type="dxa" w:w="100"/>
+            </w:tcMar>
+            <w:vAlign w:val="center"/>
+          </w:tcPr>
+          <w:p>
+            <w:pPr>
+              <w:spacing w:after="20" w:line="240"/>
+              <w:jc w:val="center"/>
+            </w:pPr>
+            <w:r>
+              <w:rPr>
+                <w:sz w:val="20"/>
+                <w:szCs w:val="20"/>
+              </w:rPr>
+              <w:t xml:space="preserve">Sprint 5</w:t>
+            </w:r>
+          </w:p>
+        </w:tc>
+        <w:tc>
+          <w:tcPr>
+            <w:tcW w:type="dxa" w:w="1796"/>
+            <w:tcBorders>
+              <w:top w:val="single" w:color="000000" w:sz="4"/>
+              <w:left w:val="single" w:color="000000" w:sz="4"/>
+              <w:bottom w:val="single" w:color="000000" w:sz="4"/>
+              <w:right w:val="single" w:color="000000" w:sz="4"/>
+            </w:tcBorders>
+            <w:tcMar>
+              <w:top w:type="dxa" w:w="60"/>
+              <w:left w:type="dxa" w:w="100"/>
+              <w:bottom w:type="dxa" w:w="60"/>
+              <w:right w:type="dxa" w:w="100"/>
+            </w:tcMar>
+            <w:vAlign w:val="center"/>
+          </w:tcPr>
+          <w:p>
+            <w:pPr>
+              <w:spacing w:after="20" w:line="240"/>
+              <w:jc w:val="center"/>
+            </w:pPr>
+            <w:r>
+              <w:rPr>
+                <w:sz w:val="20"/>
+                <w:szCs w:val="20"/>
+              </w:rPr>
+              <w:t xml:space="preserve">17/11 a 20/11/2026</w:t>
+            </w:r>
+          </w:p>
+        </w:tc>
+        <w:tc>
+          <w:tcPr>
+            <w:tcW w:type="dxa" w:w="1796"/>
+            <w:tcBorders>
+              <w:top w:val="single" w:color="000000" w:sz="4"/>
+              <w:left w:val="single" w:color="000000" w:sz="4"/>
+              <w:bottom w:val="single" w:color="000000" w:sz="4"/>
+              <w:right w:val="single" w:color="000000" w:sz="4"/>
+            </w:tcBorders>
+            <w:tcMar>
+              <w:top w:type="dxa" w:w="60"/>
+              <w:left w:type="dxa" w:w="100"/>
+              <w:bottom w:type="dxa" w:w="60"/>
+              <w:right w:type="dxa" w:w="100"/>
+            </w:tcMar>
+            <w:vAlign w:val="center"/>
+          </w:tcPr>
+          <w:p>
+            <w:pPr>
+              <w:spacing w:after="20" w:line="240"/>
+              <w:jc w:val="left"/>
+            </w:pPr>
+            <w:r>
+              <w:rPr>
+                <w:sz w:val="20"/>
+                <w:szCs w:val="20"/>
+              </w:rPr>
+              <w:t xml:space="preserve">HU14, HU16</w:t>
+            </w:r>
+          </w:p>
+        </w:tc>
+        <w:tc>
+          <w:tcPr>
+            <w:tcW w:type="dxa" w:w="4492"/>
+            <w:tcBorders>
+              <w:top w:val="single" w:color="000000" w:sz="4"/>
+              <w:left w:val="single" w:color="000000" w:sz="4"/>
+              <w:bottom w:val="single" w:color="000000" w:sz="4"/>
+              <w:right w:val="single" w:color="000000" w:sz="4"/>
+            </w:tcBorders>
+            <w:tcMar>
+              <w:top w:type="dxa" w:w="60"/>
+              <w:left w:type="dxa" w:w="100"/>
+              <w:bottom w:type="dxa" w:w="60"/>
+              <w:right w:type="dxa" w:w="100"/>
+            </w:tcMar>
+            <w:vAlign w:val="center"/>
+          </w:tcPr>
+          <w:p>
+            <w:pPr>
+              <w:spacing w:after="20" w:line="240"/>
+              <w:jc w:val="left"/>
+            </w:pPr>
+            <w:r>
+              <w:rPr>
+                <w:sz w:val="20"/>
+                <w:szCs w:val="20"/>
+              </w:rPr>
+              <w:t xml:space="preserve">Teste com jogadores de fora do grupo, troca de pombo entre fases (surgida desse teste), testes em outros computadores, ajustes finais, README, documentação de software, publicação no GitHub e ensaio da apresentação.</w:t>
             </w:r>
           </w:p>
         </w:tc>
@@ -15467,7 +15876,7 @@
         <w:jc w:val="both"/>
       </w:pPr>
       <w:r>
-        <w:t xml:space="preserve">No total o backlog soma 70 pontos. A Sprint 1 concentrou a maior parte (51 pontos), porque o grupo decidiu ter cedo uma versão jogável do começo ao fim e só depois acrescentar extras.</w:t>
+        <w:t xml:space="preserve">No total, o backlog soma 73 pontos, distribuídos em cinco sprints (18, 21, 14, 14 e 6 pontos). As duas primeiras cuidam do que o jogo precisa para funcionar: controle, entregas, HUD, perigos e fases. As duas seguintes acrescentam a história, os personagens, os recordes e as opções. A quarta também leva o jogo para o celular. A última fica reservada para testes com usuários, correções, documentação e preparação da apresentação; a troca de pombo entrou nela porque nasceu do teste descrito na seção 6.4.</w:t>
       </w:r>
     </w:p>
     <w:p>
@@ -16150,7 +16559,7 @@
                 <w:sz w:val="20"/>
                 <w:szCs w:val="20"/>
               </w:rPr>
-              <w:t xml:space="preserve">Na versão web, os toques não funcionavam.</w:t>
+              <w:t xml:space="preserve">O envelope dourado cobria o relógio da torre.</w:t>
             </w:r>
           </w:p>
         </w:tc>
@@ -16181,7 +16590,7 @@
                 <w:sz w:val="20"/>
                 <w:szCs w:val="20"/>
               </w:rPr>
-              <w:t xml:space="preserve">A camada de carregamento continuava por cima do jogo, porque a regra de CSS dela vencia o atributo hidden.</w:t>
+              <w:t xml:space="preserve">Posição calculada a partir da janela, não do topo da torre.</w:t>
             </w:r>
           </w:p>
         </w:tc>
@@ -16212,7 +16621,7 @@
                 <w:sz w:val="20"/>
                 <w:szCs w:val="20"/>
               </w:rPr>
-              <w:t xml:space="preserve">Regra específica para esconder a camada depois do carregamento.</w:t>
+              <w:t xml:space="preserve">Envelope desenhado acima do telhado da torre.</w:t>
             </w:r>
           </w:p>
         </w:tc>
@@ -16248,7 +16657,7 @@
                 <w:sz w:val="20"/>
                 <w:szCs w:val="20"/>
               </w:rPr>
-              <w:t xml:space="preserve">O envelope dourado cobria o relógio da torre.</w:t>
+              <w:t xml:space="preserve">As setas ← e → apareciam como quadrados na tela de seleção.</w:t>
             </w:r>
           </w:p>
         </w:tc>
@@ -16279,7 +16688,7 @@
                 <w:sz w:val="20"/>
                 <w:szCs w:val="20"/>
               </w:rPr>
-              <w:t xml:space="preserve">Posição calculada a partir da janela, não do topo da torre.</w:t>
+              <w:t xml:space="preserve">A fonte padrão do pygame não tem esses caracteres.</w:t>
             </w:r>
           </w:p>
         </w:tc>
@@ -16310,7 +16719,7 @@
                 <w:sz w:val="20"/>
                 <w:szCs w:val="20"/>
               </w:rPr>
-              <w:t xml:space="preserve">Envelope desenhado acima do telhado da torre.</w:t>
+              <w:t xml:space="preserve">Texto trocado por "Setas para escolher".</w:t>
             </w:r>
           </w:p>
         </w:tc>
@@ -16346,7 +16755,7 @@
                 <w:sz w:val="20"/>
                 <w:szCs w:val="20"/>
               </w:rPr>
-              <w:t xml:space="preserve">As setas ← e → apareciam como quadrados na tela de seleção.</w:t>
+              <w:t xml:space="preserve">Na versão web, os toques não funcionavam.</w:t>
             </w:r>
           </w:p>
         </w:tc>
@@ -16377,7 +16786,7 @@
                 <w:sz w:val="20"/>
                 <w:szCs w:val="20"/>
               </w:rPr>
-              <w:t xml:space="preserve">A fonte padrão do pygame não tem esses caracteres.</w:t>
+              <w:t xml:space="preserve">A camada de carregamento continuava por cima do jogo, porque a regra de CSS dela vencia o atributo hidden.</w:t>
             </w:r>
           </w:p>
         </w:tc>
@@ -16408,7 +16817,203 @@
                 <w:sz w:val="20"/>
                 <w:szCs w:val="20"/>
               </w:rPr>
-              <w:t xml:space="preserve">Texto trocado por "Setas para escolher".</w:t>
+              <w:t xml:space="preserve">Regra específica para esconder a camada depois do carregamento.</w:t>
+            </w:r>
+          </w:p>
+        </w:tc>
+      </w:tr>
+      <w:tr>
+        <w:trPr>
+          <w:cantSplit/>
+        </w:trPr>
+        <w:tc>
+          <w:tcPr>
+            <w:tcW w:type="dxa" w:w="2864"/>
+            <w:tcBorders>
+              <w:top w:val="single" w:color="000000" w:sz="4"/>
+              <w:left w:val="single" w:color="000000" w:sz="4"/>
+              <w:bottom w:val="single" w:color="000000" w:sz="4"/>
+              <w:right w:val="single" w:color="000000" w:sz="4"/>
+            </w:tcBorders>
+            <w:tcMar>
+              <w:top w:type="dxa" w:w="60"/>
+              <w:left w:type="dxa" w:w="100"/>
+              <w:bottom w:type="dxa" w:w="60"/>
+              <w:right w:type="dxa" w:w="100"/>
+            </w:tcMar>
+            <w:vAlign w:val="center"/>
+          </w:tcPr>
+          <w:p>
+            <w:pPr>
+              <w:spacing w:after="20" w:line="240"/>
+              <w:jc w:val="left"/>
+            </w:pPr>
+            <w:r>
+              <w:rPr>
+                <w:sz w:val="20"/>
+                <w:szCs w:val="20"/>
+              </w:rPr>
+              <w:t xml:space="preserve">Na versão web publicada, alguns acentos apareciam trocados e o iPhone não mostrava ícone na tela de início.</w:t>
+            </w:r>
+          </w:p>
+        </w:tc>
+        <w:tc>
+          <w:tcPr>
+            <w:tcW w:type="dxa" w:w="2864"/>
+            <w:tcBorders>
+              <w:top w:val="single" w:color="000000" w:sz="4"/>
+              <w:left w:val="single" w:color="000000" w:sz="4"/>
+              <w:bottom w:val="single" w:color="000000" w:sz="4"/>
+              <w:right w:val="single" w:color="000000" w:sz="4"/>
+            </w:tcBorders>
+            <w:tcMar>
+              <w:top w:type="dxa" w:w="60"/>
+              <w:left w:type="dxa" w:w="100"/>
+              <w:bottom w:type="dxa" w:w="60"/>
+              <w:right w:type="dxa" w:w="100"/>
+            </w:tcMar>
+            <w:vAlign w:val="center"/>
+          </w:tcPr>
+          <w:p>
+            <w:pPr>
+              <w:spacing w:after="20" w:line="240"/>
+              <w:jc w:val="left"/>
+            </w:pPr>
+            <w:r>
+              <w:rPr>
+                <w:sz w:val="20"/>
+                <w:szCs w:val="20"/>
+              </w:rPr>
+              <w:t xml:space="preserve">A página gerada não tinha cabeçalho completo: faltavam a codificação de caracteres, o viewport e os ícones.</w:t>
+            </w:r>
+          </w:p>
+        </w:tc>
+        <w:tc>
+          <w:tcPr>
+            <w:tcW w:type="dxa" w:w="3344"/>
+            <w:tcBorders>
+              <w:top w:val="single" w:color="000000" w:sz="4"/>
+              <w:left w:val="single" w:color="000000" w:sz="4"/>
+              <w:bottom w:val="single" w:color="000000" w:sz="4"/>
+              <w:right w:val="single" w:color="000000" w:sz="4"/>
+            </w:tcBorders>
+            <w:tcMar>
+              <w:top w:type="dxa" w:w="60"/>
+              <w:left w:type="dxa" w:w="100"/>
+              <w:bottom w:type="dxa" w:w="60"/>
+              <w:right w:type="dxa" w:w="100"/>
+            </w:tcMar>
+            <w:vAlign w:val="center"/>
+          </w:tcPr>
+          <w:p>
+            <w:pPr>
+              <w:spacing w:after="20" w:line="240"/>
+              <w:jc w:val="left"/>
+            </w:pPr>
+            <w:r>
+              <w:rPr>
+                <w:sz w:val="20"/>
+                <w:szCs w:val="20"/>
+              </w:rPr>
+              <w:t xml:space="preserve">O script gerar_web.py passou a montar o cabeçalho com codificação UTF-8, viewport, ícones e manifesto.</w:t>
+            </w:r>
+          </w:p>
+        </w:tc>
+      </w:tr>
+      <w:tr>
+        <w:trPr>
+          <w:cantSplit/>
+        </w:trPr>
+        <w:tc>
+          <w:tcPr>
+            <w:tcW w:type="dxa" w:w="2864"/>
+            <w:tcBorders>
+              <w:top w:val="single" w:color="000000" w:sz="4"/>
+              <w:left w:val="single" w:color="000000" w:sz="4"/>
+              <w:bottom w:val="single" w:color="000000" w:sz="4"/>
+              <w:right w:val="single" w:color="000000" w:sz="4"/>
+            </w:tcBorders>
+            <w:tcMar>
+              <w:top w:type="dxa" w:w="60"/>
+              <w:left w:type="dxa" w:w="100"/>
+              <w:bottom w:type="dxa" w:w="60"/>
+              <w:right w:type="dxa" w:w="100"/>
+            </w:tcMar>
+            <w:vAlign w:val="center"/>
+          </w:tcPr>
+          <w:p>
+            <w:pPr>
+              <w:spacing w:after="20" w:line="240"/>
+              <w:jc w:val="left"/>
+            </w:pPr>
+            <w:r>
+              <w:rPr>
+                <w:sz w:val="20"/>
+                <w:szCs w:val="20"/>
+              </w:rPr>
+              <w:t xml:space="preserve">O pombo liberado no meio da noite só podia ser usado na partida seguinte.</w:t>
+            </w:r>
+          </w:p>
+        </w:tc>
+        <w:tc>
+          <w:tcPr>
+            <w:tcW w:type="dxa" w:w="2864"/>
+            <w:tcBorders>
+              <w:top w:val="single" w:color="000000" w:sz="4"/>
+              <w:left w:val="single" w:color="000000" w:sz="4"/>
+              <w:bottom w:val="single" w:color="000000" w:sz="4"/>
+              <w:right w:val="single" w:color="000000" w:sz="4"/>
+            </w:tcBorders>
+            <w:tcMar>
+              <w:top w:type="dxa" w:w="60"/>
+              <w:left w:type="dxa" w:w="100"/>
+              <w:bottom w:type="dxa" w:w="60"/>
+              <w:right w:type="dxa" w:w="100"/>
+            </w:tcMar>
+            <w:vAlign w:val="center"/>
+          </w:tcPr>
+          <w:p>
+            <w:pPr>
+              <w:spacing w:after="20" w:line="240"/>
+              <w:jc w:val="left"/>
+            </w:pPr>
+            <w:r>
+              <w:rPr>
+                <w:sz w:val="20"/>
+                <w:szCs w:val="20"/>
+              </w:rPr>
+              <w:t xml:space="preserve">A apresentação do pombo novo apenas avisava da liberação.</w:t>
+            </w:r>
+          </w:p>
+        </w:tc>
+        <w:tc>
+          <w:tcPr>
+            <w:tcW w:type="dxa" w:w="3344"/>
+            <w:tcBorders>
+              <w:top w:val="single" w:color="000000" w:sz="4"/>
+              <w:left w:val="single" w:color="000000" w:sz="4"/>
+              <w:bottom w:val="single" w:color="000000" w:sz="4"/>
+              <w:right w:val="single" w:color="000000" w:sz="4"/>
+            </w:tcBorders>
+            <w:tcMar>
+              <w:top w:type="dxa" w:w="60"/>
+              <w:left w:type="dxa" w:w="100"/>
+              <w:bottom w:type="dxa" w:w="60"/>
+              <w:right w:type="dxa" w:w="100"/>
+            </w:tcMar>
+            <w:vAlign w:val="center"/>
+          </w:tcPr>
+          <w:p>
+            <w:pPr>
+              <w:spacing w:after="20" w:line="240"/>
+              <w:jc w:val="left"/>
+            </w:pPr>
+            <w:r>
+              <w:rPr>
+                <w:sz w:val="20"/>
+                <w:szCs w:val="20"/>
+              </w:rPr>
+              <w:t xml:space="preserve">A apresentação passou a oferecer Seguir com o pombo atual ou Voar com o novo, sem recomeçar a noite.</w:t>
             </w:r>
           </w:p>
         </w:tc>
@@ -16993,7 +17598,7 @@
         <w:jc w:val="both"/>
       </w:pPr>
       <w:r>
-        <w:t xml:space="preserve">A partida funciona como uma máquina de estados (Figura 7). Em cada estado o método atualizar faz uma coisa diferente: no interlúdio, na pausa e na apresentação de pombo liberado, o relógio da noite não anda; em jogando, tudo se move e as colisões são verificadas; em terminando, a tela escurece ou clareia antes de passar para o final da história.</w:t>
+        <w:t xml:space="preserve">A partida funciona como uma máquina de estados (Figura 7). Em cada estado o método atualizar faz uma coisa diferente: no interlúdio, na pausa e na apresentação de pombo liberado, o relógio da noite não anda; em jogando, tudo se move e as colisões são verificadas; em terminando, a tela escurece ou clareia antes de passar para o final da história. Do estado liberado, a partida segue para o interlúdio da fase seguinte com o pombo atual ou com o pombo recém-liberado, conforme a escolha do jogador.</w:t>
       </w:r>
     </w:p>
     <w:p>
@@ -17124,7 +17729,7 @@
       <w:r>
         <w:drawing>
           <wp:inline distT="0" distB="0" distL="0" distR="0">
-            <wp:extent cx="5715000" cy="3638550"/>
+            <wp:extent cx="5715000" cy="3733800"/>
             <wp:effectExtent t="0" r="0" b="0" l="0"/>
             <wp:docPr id="8" name="arquitetura.png" descr="Arquitetura em camadas do Correio Noturno" title="Arquitetura em camadas do Correio Noturno"/>
             <wp:cNvGraphicFramePr>
@@ -17149,7 +17754,7 @@
                   <pic:spPr bwMode="auto">
                     <a:xfrm>
                       <a:off x="0" y="0"/>
-                      <a:ext cx="5715000" cy="3638550"/>
+                      <a:ext cx="5715000" cy="3733800"/>
                     </a:xfrm>
                     <a:prstGeom prst="rect">
                       <a:avLst/>
@@ -17691,6 +18296,73 @@
           </w:p>
         </w:tc>
       </w:tr>
+      <w:tr>
+        <w:trPr>
+          <w:cantSplit/>
+        </w:trPr>
+        <w:tc>
+          <w:tcPr>
+            <w:tcW w:type="dxa" w:w="2721"/>
+            <w:tcBorders>
+              <w:top w:val="single" w:color="000000" w:sz="4"/>
+              <w:left w:val="single" w:color="000000" w:sz="4"/>
+              <w:bottom w:val="single" w:color="000000" w:sz="4"/>
+              <w:right w:val="single" w:color="000000" w:sz="4"/>
+            </w:tcBorders>
+            <w:tcMar>
+              <w:top w:type="dxa" w:w="60"/>
+              <w:left w:type="dxa" w:w="100"/>
+              <w:bottom w:type="dxa" w:w="60"/>
+              <w:right w:type="dxa" w:w="100"/>
+            </w:tcMar>
+            <w:vAlign w:val="center"/>
+          </w:tcPr>
+          <w:p>
+            <w:pPr>
+              <w:spacing w:after="20" w:line="240"/>
+              <w:jc w:val="left"/>
+            </w:pPr>
+            <w:r>
+              <w:rPr>
+                <w:sz w:val="20"/>
+                <w:szCs w:val="20"/>
+              </w:rPr>
+              <w:t xml:space="preserve">GitHub Pages</w:t>
+            </w:r>
+          </w:p>
+        </w:tc>
+        <w:tc>
+          <w:tcPr>
+            <w:tcW w:type="dxa" w:w="6351"/>
+            <w:tcBorders>
+              <w:top w:val="single" w:color="000000" w:sz="4"/>
+              <w:left w:val="single" w:color="000000" w:sz="4"/>
+              <w:bottom w:val="single" w:color="000000" w:sz="4"/>
+              <w:right w:val="single" w:color="000000" w:sz="4"/>
+            </w:tcBorders>
+            <w:tcMar>
+              <w:top w:type="dxa" w:w="60"/>
+              <w:left w:type="dxa" w:w="100"/>
+              <w:bottom w:type="dxa" w:w="60"/>
+              <w:right w:type="dxa" w:w="100"/>
+            </w:tcMar>
+            <w:vAlign w:val="center"/>
+          </w:tcPr>
+          <w:p>
+            <w:pPr>
+              <w:spacing w:after="20" w:line="240"/>
+              <w:jc w:val="left"/>
+            </w:pPr>
+            <w:r>
+              <w:rPr>
+                <w:sz w:val="20"/>
+                <w:szCs w:val="20"/>
+              </w:rPr>
+              <w:t xml:space="preserve">Publicação da versão web, que pode ser aberta no navegador do celular e adicionada à tela de início.</w:t>
+            </w:r>
+          </w:p>
+        </w:tc>
+      </w:tr>
     </w:tbl>
     <w:p>
       <w:pPr>
@@ -18708,7 +19380,7 @@
                 <w:sz w:val="20"/>
                 <w:szCs w:val="20"/>
               </w:rPr>
-              <w:t xml:space="preserve">Versão para celular (arquivo index.html único).</w:t>
+              <w:t xml:space="preserve">Versão para celular: arquivo index.html único, ícones e manifesto para a tela de início.</w:t>
             </w:r>
           </w:p>
         </w:tc>
@@ -19134,7 +19806,7 @@
           <w:sz w:val="20"/>
           <w:szCs w:val="20"/>
         </w:rPr>
-        <w:t xml:space="preserve">Figura 12 – Apresentação de um pombo liberado ao concluir a fase</w:t>
+        <w:t xml:space="preserve">Figura 12 – Apresentação de um pombo liberado, com a escolha entre seguir ou trocar de pombo</w:t>
       </w:r>
     </w:p>
     <w:p>
@@ -19148,7 +19820,7 @@
           <wp:inline distT="0" distB="0" distL="0" distR="0">
             <wp:extent cx="4953000" cy="3305175"/>
             <wp:effectExtent t="0" r="0" b="0" l="0"/>
-            <wp:docPr id="12" name="10_liberado.png" descr="Apresentação de um pombo liberado ao concluir a fase" title="Apresentação de um pombo liberado ao concluir a fase"/>
+            <wp:docPr id="12" name="10_liberado.png" descr="Apresentação de um pombo liberado, com a escolha entre seguir ou trocar de pombo" title="Apresentação de um pombo liberado, com a escolha entre seguir ou trocar de pombo"/>
             <wp:cNvGraphicFramePr>
               <a:graphicFrameLocks xmlns:a="http://schemas.openxmlformats.org/drawingml/2006/main" noChangeAspect="1"/>
             </wp:cNvGraphicFramePr>
@@ -19294,7 +19966,7 @@
       <w:r>
         <w:drawing>
           <wp:inline distT="0" distB="0" distL="0" distR="0">
-            <wp:extent cx="2276475" cy="4953000"/>
+            <wp:extent cx="2457450" cy="5334000"/>
             <wp:effectExtent t="0" r="0" b="0" l="0"/>
             <wp:docPr id="14" name="web_jogo.png" descr="Versão web no celular, com o botão de arrancada" title="Versão web no celular, com o botão de arrancada"/>
             <wp:cNvGraphicFramePr>
@@ -19319,7 +19991,7 @@
                   <pic:spPr bwMode="auto">
                     <a:xfrm>
                       <a:off x="0" y="0"/>
-                      <a:ext cx="2276475" cy="4953000"/>
+                      <a:ext cx="2457450" cy="5334000"/>
                     </a:xfrm>
                     <a:prstGeom prst="rect">
                       <a:avLst/>
@@ -19383,7 +20055,7 @@
         <w:jc w:val="both"/>
       </w:pPr>
       <w:r>
-        <w:t xml:space="preserve">A versão web foi testada num navegador Chromium simulando a tela de um iPhone (402 × 874 pontos, com toque), conferindo os toques nos botões, a seleção de pombos, a apresentação de pombo liberado, os finais e a gravação de recordes, além de verificar que nenhum erro de JavaScript aparece no console.</w:t>
+        <w:t xml:space="preserve">A versão web foi testada num navegador Chromium simulando a tela de um iPhone (402 × 874 pontos, com toque), conferindo os toques nos botões, a seleção de pombos, a apresentação de pombo liberado com a troca de pombo, os finais e a gravação de recordes, além de verificar que nenhum erro de JavaScript aparece no console. Por fim, o jogo foi entregue a jogadores de fora do grupo, como descreve a seção 6.4.</w:t>
       </w:r>
     </w:p>
     <w:p>
@@ -22026,7 +22698,7 @@
                 <w:sz w:val="20"/>
                 <w:szCs w:val="20"/>
               </w:rPr>
-              <w:t xml:space="preserve">Abrir a versão web num celular simulado e jogar com toque.</w:t>
+              <w:t xml:space="preserve">Concluir a fase 1 pela primeira vez com o Bico e escolher Voar com Pipoca.</w:t>
             </w:r>
           </w:p>
         </w:tc>
@@ -22057,7 +22729,7 @@
                 <w:sz w:val="20"/>
                 <w:szCs w:val="20"/>
               </w:rPr>
-              <w:t xml:space="preserve">Botões respondem, o joystick move o pombo e não há erros no console.</w:t>
+              <w:t xml:space="preserve">A fase 2 começa com a Pipoca, com as mesmas cartas na bolsa e uma pena a menos, e ela fica escolhida para a próxima partida.</w:t>
             </w:r>
           </w:p>
         </w:tc>
@@ -22155,7 +22827,7 @@
                 <w:sz w:val="20"/>
                 <w:szCs w:val="20"/>
               </w:rPr>
-              <w:t xml:space="preserve">Conferir volume e equilíbrio de música e efeitos com fone de ouvido.</w:t>
+              <w:t xml:space="preserve">Repetir o CT10 escolhendo Seguir com Bico.</w:t>
             </w:r>
           </w:p>
         </w:tc>
@@ -22186,7 +22858,7 @@
                 <w:sz w:val="20"/>
                 <w:szCs w:val="20"/>
               </w:rPr>
-              <w:t xml:space="preserve">Música e efeitos audíveis, sem um encobrir o outro.</w:t>
+              <w:t xml:space="preserve">A fase 2 começa com o Bico, sem mudança nas penas nem nas cartas.</w:t>
             </w:r>
           </w:p>
         </w:tc>
@@ -22217,7 +22889,7 @@
                 <w:sz w:val="20"/>
                 <w:szCs w:val="20"/>
               </w:rPr>
-              <w:t xml:space="preserve">A verificar pelo grupo</w:t>
+              <w:t xml:space="preserve">Aprovado</w:t>
             </w:r>
           </w:p>
         </w:tc>
@@ -22284,6 +22956,393 @@
                 <w:sz w:val="20"/>
                 <w:szCs w:val="20"/>
               </w:rPr>
+              <w:t xml:space="preserve">Abrir a versão web num celular simulado e jogar com toque.</w:t>
+            </w:r>
+          </w:p>
+        </w:tc>
+        <w:tc>
+          <w:tcPr>
+            <w:tcW w:type="dxa" w:w="3265"/>
+            <w:tcBorders>
+              <w:top w:val="single" w:color="000000" w:sz="4"/>
+              <w:left w:val="single" w:color="000000" w:sz="4"/>
+              <w:bottom w:val="single" w:color="000000" w:sz="4"/>
+              <w:right w:val="single" w:color="000000" w:sz="4"/>
+            </w:tcBorders>
+            <w:tcMar>
+              <w:top w:type="dxa" w:w="60"/>
+              <w:left w:type="dxa" w:w="100"/>
+              <w:bottom w:type="dxa" w:w="60"/>
+              <w:right w:type="dxa" w:w="100"/>
+            </w:tcMar>
+            <w:vAlign w:val="center"/>
+          </w:tcPr>
+          <w:p>
+            <w:pPr>
+              <w:spacing w:after="20" w:line="240"/>
+              <w:jc w:val="left"/>
+            </w:pPr>
+            <w:r>
+              <w:rPr>
+                <w:sz w:val="20"/>
+                <w:szCs w:val="20"/>
+              </w:rPr>
+              <w:t xml:space="preserve">Botões respondem, o joystick move o pombo e não há erros no console.</w:t>
+            </w:r>
+          </w:p>
+        </w:tc>
+        <w:tc>
+          <w:tcPr>
+            <w:tcW w:type="dxa" w:w="1635"/>
+            <w:tcBorders>
+              <w:top w:val="single" w:color="000000" w:sz="4"/>
+              <w:left w:val="single" w:color="000000" w:sz="4"/>
+              <w:bottom w:val="single" w:color="000000" w:sz="4"/>
+              <w:right w:val="single" w:color="000000" w:sz="4"/>
+            </w:tcBorders>
+            <w:tcMar>
+              <w:top w:type="dxa" w:w="60"/>
+              <w:left w:type="dxa" w:w="100"/>
+              <w:bottom w:type="dxa" w:w="60"/>
+              <w:right w:type="dxa" w:w="100"/>
+            </w:tcMar>
+            <w:vAlign w:val="center"/>
+          </w:tcPr>
+          <w:p>
+            <w:pPr>
+              <w:spacing w:after="20" w:line="240"/>
+              <w:jc w:val="center"/>
+            </w:pPr>
+            <w:r>
+              <w:rPr>
+                <w:sz w:val="20"/>
+                <w:szCs w:val="20"/>
+              </w:rPr>
+              <w:t xml:space="preserve">Aprovado</w:t>
+            </w:r>
+          </w:p>
+        </w:tc>
+      </w:tr>
+      <w:tr>
+        <w:trPr>
+          <w:cantSplit/>
+        </w:trPr>
+        <w:tc>
+          <w:tcPr>
+            <w:tcW w:type="dxa" w:w="907"/>
+            <w:tcBorders>
+              <w:top w:val="single" w:color="000000" w:sz="4"/>
+              <w:left w:val="single" w:color="000000" w:sz="4"/>
+              <w:bottom w:val="single" w:color="000000" w:sz="4"/>
+              <w:right w:val="single" w:color="000000" w:sz="4"/>
+            </w:tcBorders>
+            <w:tcMar>
+              <w:top w:type="dxa" w:w="60"/>
+              <w:left w:type="dxa" w:w="100"/>
+              <w:bottom w:type="dxa" w:w="60"/>
+              <w:right w:type="dxa" w:w="100"/>
+            </w:tcMar>
+            <w:vAlign w:val="center"/>
+          </w:tcPr>
+          <w:p>
+            <w:pPr>
+              <w:spacing w:after="20" w:line="240"/>
+              <w:jc w:val="center"/>
+            </w:pPr>
+            <w:r>
+              <w:rPr>
+                <w:sz w:val="20"/>
+                <w:szCs w:val="20"/>
+              </w:rPr>
+              <w:t xml:space="preserve">CT13</w:t>
+            </w:r>
+          </w:p>
+        </w:tc>
+        <w:tc>
+          <w:tcPr>
+            <w:tcW w:type="dxa" w:w="3265"/>
+            <w:tcBorders>
+              <w:top w:val="single" w:color="000000" w:sz="4"/>
+              <w:left w:val="single" w:color="000000" w:sz="4"/>
+              <w:bottom w:val="single" w:color="000000" w:sz="4"/>
+              <w:right w:val="single" w:color="000000" w:sz="4"/>
+            </w:tcBorders>
+            <w:tcMar>
+              <w:top w:type="dxa" w:w="60"/>
+              <w:left w:type="dxa" w:w="100"/>
+              <w:bottom w:type="dxa" w:w="60"/>
+              <w:right w:type="dxa" w:w="100"/>
+            </w:tcMar>
+            <w:vAlign w:val="center"/>
+          </w:tcPr>
+          <w:p>
+            <w:pPr>
+              <w:spacing w:after="20" w:line="240"/>
+              <w:jc w:val="left"/>
+            </w:pPr>
+            <w:r>
+              <w:rPr>
+                <w:sz w:val="20"/>
+                <w:szCs w:val="20"/>
+              </w:rPr>
+              <w:t xml:space="preserve">Adicionar a versão web à tela de início de um iPhone pelo Safari.</w:t>
+            </w:r>
+          </w:p>
+        </w:tc>
+        <w:tc>
+          <w:tcPr>
+            <w:tcW w:type="dxa" w:w="3265"/>
+            <w:tcBorders>
+              <w:top w:val="single" w:color="000000" w:sz="4"/>
+              <w:left w:val="single" w:color="000000" w:sz="4"/>
+              <w:bottom w:val="single" w:color="000000" w:sz="4"/>
+              <w:right w:val="single" w:color="000000" w:sz="4"/>
+            </w:tcBorders>
+            <w:tcMar>
+              <w:top w:type="dxa" w:w="60"/>
+              <w:left w:type="dxa" w:w="100"/>
+              <w:bottom w:type="dxa" w:w="60"/>
+              <w:right w:type="dxa" w:w="100"/>
+            </w:tcMar>
+            <w:vAlign w:val="center"/>
+          </w:tcPr>
+          <w:p>
+            <w:pPr>
+              <w:spacing w:after="20" w:line="240"/>
+              <w:jc w:val="left"/>
+            </w:pPr>
+            <w:r>
+              <w:rPr>
+                <w:sz w:val="20"/>
+                <w:szCs w:val="20"/>
+              </w:rPr>
+              <w:t xml:space="preserve">O atalho aparece com o ícone e o nome Correio Noturno e abre o jogo em tela cheia.</w:t>
+            </w:r>
+          </w:p>
+        </w:tc>
+        <w:tc>
+          <w:tcPr>
+            <w:tcW w:type="dxa" w:w="1635"/>
+            <w:tcBorders>
+              <w:top w:val="single" w:color="000000" w:sz="4"/>
+              <w:left w:val="single" w:color="000000" w:sz="4"/>
+              <w:bottom w:val="single" w:color="000000" w:sz="4"/>
+              <w:right w:val="single" w:color="000000" w:sz="4"/>
+            </w:tcBorders>
+            <w:tcMar>
+              <w:top w:type="dxa" w:w="60"/>
+              <w:left w:type="dxa" w:w="100"/>
+              <w:bottom w:type="dxa" w:w="60"/>
+              <w:right w:type="dxa" w:w="100"/>
+            </w:tcMar>
+            <w:vAlign w:val="center"/>
+          </w:tcPr>
+          <w:p>
+            <w:pPr>
+              <w:spacing w:after="20" w:line="240"/>
+              <w:jc w:val="center"/>
+            </w:pPr>
+            <w:r>
+              <w:rPr>
+                <w:sz w:val="20"/>
+                <w:szCs w:val="20"/>
+              </w:rPr>
+              <w:t xml:space="preserve">A verificar pelo grupo</w:t>
+            </w:r>
+          </w:p>
+        </w:tc>
+      </w:tr>
+      <w:tr>
+        <w:trPr>
+          <w:cantSplit/>
+        </w:trPr>
+        <w:tc>
+          <w:tcPr>
+            <w:tcW w:type="dxa" w:w="907"/>
+            <w:tcBorders>
+              <w:top w:val="single" w:color="000000" w:sz="4"/>
+              <w:left w:val="single" w:color="000000" w:sz="4"/>
+              <w:bottom w:val="single" w:color="000000" w:sz="4"/>
+              <w:right w:val="single" w:color="000000" w:sz="4"/>
+            </w:tcBorders>
+            <w:tcMar>
+              <w:top w:type="dxa" w:w="60"/>
+              <w:left w:type="dxa" w:w="100"/>
+              <w:bottom w:type="dxa" w:w="60"/>
+              <w:right w:type="dxa" w:w="100"/>
+            </w:tcMar>
+            <w:vAlign w:val="center"/>
+          </w:tcPr>
+          <w:p>
+            <w:pPr>
+              <w:spacing w:after="20" w:line="240"/>
+              <w:jc w:val="center"/>
+            </w:pPr>
+            <w:r>
+              <w:rPr>
+                <w:sz w:val="20"/>
+                <w:szCs w:val="20"/>
+              </w:rPr>
+              <w:t xml:space="preserve">CT14</w:t>
+            </w:r>
+          </w:p>
+        </w:tc>
+        <w:tc>
+          <w:tcPr>
+            <w:tcW w:type="dxa" w:w="3265"/>
+            <w:tcBorders>
+              <w:top w:val="single" w:color="000000" w:sz="4"/>
+              <w:left w:val="single" w:color="000000" w:sz="4"/>
+              <w:bottom w:val="single" w:color="000000" w:sz="4"/>
+              <w:right w:val="single" w:color="000000" w:sz="4"/>
+            </w:tcBorders>
+            <w:tcMar>
+              <w:top w:type="dxa" w:w="60"/>
+              <w:left w:type="dxa" w:w="100"/>
+              <w:bottom w:type="dxa" w:w="60"/>
+              <w:right w:type="dxa" w:w="100"/>
+            </w:tcMar>
+            <w:vAlign w:val="center"/>
+          </w:tcPr>
+          <w:p>
+            <w:pPr>
+              <w:spacing w:after="20" w:line="240"/>
+              <w:jc w:val="left"/>
+            </w:pPr>
+            <w:r>
+              <w:rPr>
+                <w:sz w:val="20"/>
+                <w:szCs w:val="20"/>
+              </w:rPr>
+              <w:t xml:space="preserve">Conferir volume e equilíbrio de música e efeitos com fone de ouvido.</w:t>
+            </w:r>
+          </w:p>
+        </w:tc>
+        <w:tc>
+          <w:tcPr>
+            <w:tcW w:type="dxa" w:w="3265"/>
+            <w:tcBorders>
+              <w:top w:val="single" w:color="000000" w:sz="4"/>
+              <w:left w:val="single" w:color="000000" w:sz="4"/>
+              <w:bottom w:val="single" w:color="000000" w:sz="4"/>
+              <w:right w:val="single" w:color="000000" w:sz="4"/>
+            </w:tcBorders>
+            <w:tcMar>
+              <w:top w:type="dxa" w:w="60"/>
+              <w:left w:type="dxa" w:w="100"/>
+              <w:bottom w:type="dxa" w:w="60"/>
+              <w:right w:type="dxa" w:w="100"/>
+            </w:tcMar>
+            <w:vAlign w:val="center"/>
+          </w:tcPr>
+          <w:p>
+            <w:pPr>
+              <w:spacing w:after="20" w:line="240"/>
+              <w:jc w:val="left"/>
+            </w:pPr>
+            <w:r>
+              <w:rPr>
+                <w:sz w:val="20"/>
+                <w:szCs w:val="20"/>
+              </w:rPr>
+              <w:t xml:space="preserve">Música e efeitos audíveis, sem um encobrir o outro.</w:t>
+            </w:r>
+          </w:p>
+        </w:tc>
+        <w:tc>
+          <w:tcPr>
+            <w:tcW w:type="dxa" w:w="1635"/>
+            <w:tcBorders>
+              <w:top w:val="single" w:color="000000" w:sz="4"/>
+              <w:left w:val="single" w:color="000000" w:sz="4"/>
+              <w:bottom w:val="single" w:color="000000" w:sz="4"/>
+              <w:right w:val="single" w:color="000000" w:sz="4"/>
+            </w:tcBorders>
+            <w:tcMar>
+              <w:top w:type="dxa" w:w="60"/>
+              <w:left w:type="dxa" w:w="100"/>
+              <w:bottom w:type="dxa" w:w="60"/>
+              <w:right w:type="dxa" w:w="100"/>
+            </w:tcMar>
+            <w:vAlign w:val="center"/>
+          </w:tcPr>
+          <w:p>
+            <w:pPr>
+              <w:spacing w:after="20" w:line="240"/>
+              <w:jc w:val="center"/>
+            </w:pPr>
+            <w:r>
+              <w:rPr>
+                <w:sz w:val="20"/>
+                <w:szCs w:val="20"/>
+              </w:rPr>
+              <w:t xml:space="preserve">A verificar pelo grupo</w:t>
+            </w:r>
+          </w:p>
+        </w:tc>
+      </w:tr>
+      <w:tr>
+        <w:trPr>
+          <w:cantSplit/>
+        </w:trPr>
+        <w:tc>
+          <w:tcPr>
+            <w:tcW w:type="dxa" w:w="907"/>
+            <w:tcBorders>
+              <w:top w:val="single" w:color="000000" w:sz="4"/>
+              <w:left w:val="single" w:color="000000" w:sz="4"/>
+              <w:bottom w:val="single" w:color="000000" w:sz="4"/>
+              <w:right w:val="single" w:color="000000" w:sz="4"/>
+            </w:tcBorders>
+            <w:tcMar>
+              <w:top w:type="dxa" w:w="60"/>
+              <w:left w:type="dxa" w:w="100"/>
+              <w:bottom w:type="dxa" w:w="60"/>
+              <w:right w:type="dxa" w:w="100"/>
+            </w:tcMar>
+            <w:vAlign w:val="center"/>
+          </w:tcPr>
+          <w:p>
+            <w:pPr>
+              <w:spacing w:after="20" w:line="240"/>
+              <w:jc w:val="center"/>
+            </w:pPr>
+            <w:r>
+              <w:rPr>
+                <w:sz w:val="20"/>
+                <w:szCs w:val="20"/>
+              </w:rPr>
+              <w:t xml:space="preserve">CT15</w:t>
+            </w:r>
+          </w:p>
+        </w:tc>
+        <w:tc>
+          <w:tcPr>
+            <w:tcW w:type="dxa" w:w="3265"/>
+            <w:tcBorders>
+              <w:top w:val="single" w:color="000000" w:sz="4"/>
+              <w:left w:val="single" w:color="000000" w:sz="4"/>
+              <w:bottom w:val="single" w:color="000000" w:sz="4"/>
+              <w:right w:val="single" w:color="000000" w:sz="4"/>
+            </w:tcBorders>
+            <w:tcMar>
+              <w:top w:type="dxa" w:w="60"/>
+              <w:left w:type="dxa" w:w="100"/>
+              <w:bottom w:type="dxa" w:w="60"/>
+              <w:right w:type="dxa" w:w="100"/>
+            </w:tcMar>
+            <w:vAlign w:val="center"/>
+          </w:tcPr>
+          <w:p>
+            <w:pPr>
+              <w:spacing w:after="20" w:line="240"/>
+              <w:jc w:val="left"/>
+            </w:pPr>
+            <w:r>
+              <w:rPr>
+                <w:sz w:val="20"/>
+                <w:szCs w:val="20"/>
+              </w:rPr>
               <w:t xml:space="preserve">Rodar o jogo em outro computador do grupo (Windows).</w:t>
             </w:r>
           </w:p>
@@ -22372,7 +23431,413 @@
         <w:jc w:val="both"/>
       </w:pPr>
       <w:r>
-        <w:t xml:space="preserve">Os casos CT11 e CT12 dependem de equipamento real: o robô roda sem placa de som, e o enunciado pede explicitamente que as instruções sejam testadas em outro computador.</w:t>
+        <w:t xml:space="preserve">Os casos CT13, CT14 e CT15 dependem de equipamento real: o robô não tem um iPhone nem placa de som, e o enunciado pede explicitamente que as instruções sejam testadas em outro computador.</w:t>
+      </w:r>
+    </w:p>
+    <w:p>
+      <w:pPr>
+        <w:pStyle w:val="Heading2"/>
+        <w:keepNext/>
+        <w:spacing w:after="240" w:before="360" w:line="360"/>
+      </w:pPr>
+      <w:r>
+        <w:t xml:space="preserve">6.4 Teste com usuários</w:t>
+      </w:r>
+    </w:p>
+    <w:p>
+      <w:pPr>
+        <w:spacing w:after="120" w:before="0" w:line="360"/>
+        <w:ind w:firstLine="709"/>
+        <w:jc w:val="both"/>
+      </w:pPr>
+      <w:r>
+        <w:t xml:space="preserve">Depois dos testes automáticos, o jogo foi entregue a dois jogadores de fora do grupo, Gabriel e Isa, que jogaram a versão web no celular e mandaram suas impressões por mensagem. Não houve roteiro nem medição de tempo: o objetivo era ver como pessoas que não acompanharam o desenvolvimento reagiam ao jogo. O Quadro 18 resume o que foi observado e o que o grupo fez com cada ponto.</w:t>
+      </w:r>
+    </w:p>
+    <w:p>
+      <w:pPr>
+        <w:keepNext/>
+        <w:spacing w:after="80" w:before="200" w:line="240"/>
+        <w:jc w:val="center"/>
+      </w:pPr>
+      <w:r>
+        <w:rPr>
+          <w:sz w:val="20"/>
+          <w:szCs w:val="20"/>
+        </w:rPr>
+        <w:t xml:space="preserve">Quadro 18 – Observações do teste com usuários</w:t>
+      </w:r>
+    </w:p>
+    <w:tbl>
+      <w:tblPr>
+        <w:tblW w:type="dxa" w:w="9072"/>
+        <w:tblBorders>
+          <w:top w:val="single" w:color="auto" w:sz="4"/>
+          <w:left w:val="single" w:color="auto" w:sz="4"/>
+          <w:bottom w:val="single" w:color="auto" w:sz="4"/>
+          <w:right w:val="single" w:color="auto" w:sz="4"/>
+          <w:insideH w:val="single" w:color="auto" w:sz="4"/>
+          <w:insideV w:val="single" w:color="auto" w:sz="4"/>
+        </w:tblBorders>
+      </w:tblPr>
+      <w:tblGrid>
+        <w:gridCol w:w="4536"/>
+        <w:gridCol w:w="4536"/>
+      </w:tblGrid>
+      <w:tr>
+        <w:trPr>
+          <w:cantSplit/>
+          <w:tblHeader/>
+        </w:trPr>
+        <w:tc>
+          <w:tcPr>
+            <w:tcW w:type="dxa" w:w="4536"/>
+            <w:tcBorders>
+              <w:top w:val="single" w:color="000000" w:sz="4"/>
+              <w:left w:val="single" w:color="000000" w:sz="4"/>
+              <w:bottom w:val="single" w:color="000000" w:sz="4"/>
+              <w:right w:val="single" w:color="000000" w:sz="4"/>
+            </w:tcBorders>
+            <w:shd w:fill="E7E6E6" w:color="auto" w:val="clear"/>
+            <w:tcMar>
+              <w:top w:type="dxa" w:w="60"/>
+              <w:left w:type="dxa" w:w="100"/>
+              <w:bottom w:type="dxa" w:w="60"/>
+              <w:right w:type="dxa" w:w="100"/>
+            </w:tcMar>
+            <w:vAlign w:val="center"/>
+          </w:tcPr>
+          <w:p>
+            <w:pPr>
+              <w:spacing w:after="20" w:line="240"/>
+              <w:jc w:val="center"/>
+            </w:pPr>
+            <w:r>
+              <w:rPr>
+                <w:b/>
+                <w:bCs/>
+                <w:sz w:val="20"/>
+                <w:szCs w:val="20"/>
+              </w:rPr>
+              <w:t xml:space="preserve">Observação</w:t>
+            </w:r>
+          </w:p>
+        </w:tc>
+        <w:tc>
+          <w:tcPr>
+            <w:tcW w:type="dxa" w:w="4536"/>
+            <w:tcBorders>
+              <w:top w:val="single" w:color="000000" w:sz="4"/>
+              <w:left w:val="single" w:color="000000" w:sz="4"/>
+              <w:bottom w:val="single" w:color="000000" w:sz="4"/>
+              <w:right w:val="single" w:color="000000" w:sz="4"/>
+            </w:tcBorders>
+            <w:shd w:fill="E7E6E6" w:color="auto" w:val="clear"/>
+            <w:tcMar>
+              <w:top w:type="dxa" w:w="60"/>
+              <w:left w:type="dxa" w:w="100"/>
+              <w:bottom w:type="dxa" w:w="60"/>
+              <w:right w:type="dxa" w:w="100"/>
+            </w:tcMar>
+            <w:vAlign w:val="center"/>
+          </w:tcPr>
+          <w:p>
+            <w:pPr>
+              <w:spacing w:after="20" w:line="240"/>
+              <w:jc w:val="center"/>
+            </w:pPr>
+            <w:r>
+              <w:rPr>
+                <w:b/>
+                <w:bCs/>
+                <w:sz w:val="20"/>
+                <w:szCs w:val="20"/>
+              </w:rPr>
+              <w:t xml:space="preserve">Decisão do grupo</w:t>
+            </w:r>
+          </w:p>
+        </w:tc>
+      </w:tr>
+      <w:tr>
+        <w:trPr>
+          <w:cantSplit/>
+        </w:trPr>
+        <w:tc>
+          <w:tcPr>
+            <w:tcW w:type="dxa" w:w="4536"/>
+            <w:tcBorders>
+              <w:top w:val="single" w:color="000000" w:sz="4"/>
+              <w:left w:val="single" w:color="000000" w:sz="4"/>
+              <w:bottom w:val="single" w:color="000000" w:sz="4"/>
+              <w:right w:val="single" w:color="000000" w:sz="4"/>
+            </w:tcBorders>
+            <w:tcMar>
+              <w:top w:type="dxa" w:w="60"/>
+              <w:left w:type="dxa" w:w="100"/>
+              <w:bottom w:type="dxa" w:w="60"/>
+              <w:right w:type="dxa" w:w="100"/>
+            </w:tcMar>
+            <w:vAlign w:val="center"/>
+          </w:tcPr>
+          <w:p>
+            <w:pPr>
+              <w:spacing w:after="20" w:line="240"/>
+              <w:jc w:val="left"/>
+            </w:pPr>
+            <w:r>
+              <w:rPr>
+                <w:sz w:val="20"/>
+                <w:szCs w:val="20"/>
+              </w:rPr>
+              <w:t xml:space="preserve">A história envolve e o propósito do jogo fica bem definido.</w:t>
+            </w:r>
+          </w:p>
+        </w:tc>
+        <w:tc>
+          <w:tcPr>
+            <w:tcW w:type="dxa" w:w="4536"/>
+            <w:tcBorders>
+              <w:top w:val="single" w:color="000000" w:sz="4"/>
+              <w:left w:val="single" w:color="000000" w:sz="4"/>
+              <w:bottom w:val="single" w:color="000000" w:sz="4"/>
+              <w:right w:val="single" w:color="000000" w:sz="4"/>
+            </w:tcBorders>
+            <w:tcMar>
+              <w:top w:type="dxa" w:w="60"/>
+              <w:left w:type="dxa" w:w="100"/>
+              <w:bottom w:type="dxa" w:w="60"/>
+              <w:right w:type="dxa" w:w="100"/>
+            </w:tcMar>
+            <w:vAlign w:val="center"/>
+          </w:tcPr>
+          <w:p>
+            <w:pPr>
+              <w:spacing w:after="20" w:line="240"/>
+              <w:jc w:val="left"/>
+            </w:pPr>
+            <w:r>
+              <w:rPr>
+                <w:sz w:val="20"/>
+                <w:szCs w:val="20"/>
+              </w:rPr>
+              <w:t xml:space="preserve">Mantida como está. Confirma que a introdução e as falas entre fases cumprem o papel de explicar o objetivo.</w:t>
+            </w:r>
+          </w:p>
+        </w:tc>
+      </w:tr>
+      <w:tr>
+        <w:trPr>
+          <w:cantSplit/>
+        </w:trPr>
+        <w:tc>
+          <w:tcPr>
+            <w:tcW w:type="dxa" w:w="4536"/>
+            <w:tcBorders>
+              <w:top w:val="single" w:color="000000" w:sz="4"/>
+              <w:left w:val="single" w:color="000000" w:sz="4"/>
+              <w:bottom w:val="single" w:color="000000" w:sz="4"/>
+              <w:right w:val="single" w:color="000000" w:sz="4"/>
+            </w:tcBorders>
+            <w:tcMar>
+              <w:top w:type="dxa" w:w="60"/>
+              <w:left w:type="dxa" w:w="100"/>
+              <w:bottom w:type="dxa" w:w="60"/>
+              <w:right w:type="dxa" w:w="100"/>
+            </w:tcMar>
+            <w:vAlign w:val="center"/>
+          </w:tcPr>
+          <w:p>
+            <w:pPr>
+              <w:spacing w:after="20" w:line="240"/>
+              <w:jc w:val="left"/>
+            </w:pPr>
+            <w:r>
+              <w:rPr>
+                <w:sz w:val="20"/>
+                <w:szCs w:val="20"/>
+              </w:rPr>
+              <w:t xml:space="preserve">Para quem não costuma jogar, o jogo fica mais difícil: a Isa precisou de cerca de cinco tentativas na fase 2.</w:t>
+            </w:r>
+          </w:p>
+        </w:tc>
+        <w:tc>
+          <w:tcPr>
+            <w:tcW w:type="dxa" w:w="4536"/>
+            <w:tcBorders>
+              <w:top w:val="single" w:color="000000" w:sz="4"/>
+              <w:left w:val="single" w:color="000000" w:sz="4"/>
+              <w:bottom w:val="single" w:color="000000" w:sz="4"/>
+              <w:right w:val="single" w:color="000000" w:sz="4"/>
+            </w:tcBorders>
+            <w:tcMar>
+              <w:top w:type="dxa" w:w="60"/>
+              <w:left w:type="dxa" w:w="100"/>
+              <w:bottom w:type="dxa" w:w="60"/>
+              <w:right w:type="dxa" w:w="100"/>
+            </w:tcMar>
+            <w:vAlign w:val="center"/>
+          </w:tcPr>
+          <w:p>
+            <w:pPr>
+              <w:spacing w:after="20" w:line="240"/>
+              <w:jc w:val="left"/>
+            </w:pPr>
+            <w:r>
+              <w:rPr>
+                <w:sz w:val="20"/>
+                <w:szCs w:val="20"/>
+              </w:rPr>
+              <w:t xml:space="preserve">Registrado para os próximos testes. A fase 2 é a primeira com corvos e fios que ligam e desligam; o grupo vai observar se a dificuldade Fácil é suficiente para esse público antes de mudar o balanceamento.</w:t>
+            </w:r>
+          </w:p>
+        </w:tc>
+      </w:tr>
+      <w:tr>
+        <w:trPr>
+          <w:cantSplit/>
+        </w:trPr>
+        <w:tc>
+          <w:tcPr>
+            <w:tcW w:type="dxa" w:w="4536"/>
+            <w:tcBorders>
+              <w:top w:val="single" w:color="000000" w:sz="4"/>
+              <w:left w:val="single" w:color="000000" w:sz="4"/>
+              <w:bottom w:val="single" w:color="000000" w:sz="4"/>
+              <w:right w:val="single" w:color="000000" w:sz="4"/>
+            </w:tcBorders>
+            <w:tcMar>
+              <w:top w:type="dxa" w:w="60"/>
+              <w:left w:type="dxa" w:w="100"/>
+              <w:bottom w:type="dxa" w:w="60"/>
+              <w:right w:type="dxa" w:w="100"/>
+            </w:tcMar>
+            <w:vAlign w:val="center"/>
+          </w:tcPr>
+          <w:p>
+            <w:pPr>
+              <w:spacing w:after="20" w:line="240"/>
+              <w:jc w:val="left"/>
+            </w:pPr>
+            <w:r>
+              <w:rPr>
+                <w:sz w:val="20"/>
+                <w:szCs w:val="20"/>
+              </w:rPr>
+              <w:t xml:space="preserve">Ao perder, o jogo volta para a fase 1, mesmo para quem já tinha chegado à fase 2 e liberado um pombo novo.</w:t>
+            </w:r>
+          </w:p>
+        </w:tc>
+        <w:tc>
+          <w:tcPr>
+            <w:tcW w:type="dxa" w:w="4536"/>
+            <w:tcBorders>
+              <w:top w:val="single" w:color="000000" w:sz="4"/>
+              <w:left w:val="single" w:color="000000" w:sz="4"/>
+              <w:bottom w:val="single" w:color="000000" w:sz="4"/>
+              <w:right w:val="single" w:color="000000" w:sz="4"/>
+            </w:tcBorders>
+            <w:tcMar>
+              <w:top w:type="dxa" w:w="60"/>
+              <w:left w:type="dxa" w:w="100"/>
+              <w:bottom w:type="dxa" w:w="60"/>
+              <w:right w:type="dxa" w:w="100"/>
+            </w:tcMar>
+            <w:vAlign w:val="center"/>
+          </w:tcPr>
+          <w:p>
+            <w:pPr>
+              <w:spacing w:after="20" w:line="240"/>
+              <w:jc w:val="left"/>
+            </w:pPr>
+            <w:r>
+              <w:rPr>
+                <w:sz w:val="20"/>
+                <w:szCs w:val="20"/>
+              </w:rPr>
+              <w:t xml:space="preserve">Mantido como regra: a noite inteira é uma partida só, e o próprio testador considerou isso parte da dinâmica do jogo, como acontece em outros jogos do gênero.</w:t>
+            </w:r>
+          </w:p>
+        </w:tc>
+      </w:tr>
+      <w:tr>
+        <w:trPr>
+          <w:cantSplit/>
+        </w:trPr>
+        <w:tc>
+          <w:tcPr>
+            <w:tcW w:type="dxa" w:w="4536"/>
+            <w:tcBorders>
+              <w:top w:val="single" w:color="000000" w:sz="4"/>
+              <w:left w:val="single" w:color="000000" w:sz="4"/>
+              <w:bottom w:val="single" w:color="000000" w:sz="4"/>
+              <w:right w:val="single" w:color="000000" w:sz="4"/>
+            </w:tcBorders>
+            <w:tcMar>
+              <w:top w:type="dxa" w:w="60"/>
+              <w:left w:type="dxa" w:w="100"/>
+              <w:bottom w:type="dxa" w:w="60"/>
+              <w:right w:type="dxa" w:w="100"/>
+            </w:tcMar>
+            <w:vAlign w:val="center"/>
+          </w:tcPr>
+          <w:p>
+            <w:pPr>
+              <w:spacing w:after="20" w:line="240"/>
+              <w:jc w:val="left"/>
+            </w:pPr>
+            <w:r>
+              <w:rPr>
+                <w:sz w:val="20"/>
+                <w:szCs w:val="20"/>
+              </w:rPr>
+              <w:t xml:space="preserve">O pombo liberado na fase 2 só podia ser escolhido na partida seguinte, depois de perder ou vencer.</w:t>
+            </w:r>
+          </w:p>
+        </w:tc>
+        <w:tc>
+          <w:tcPr>
+            <w:tcW w:type="dxa" w:w="4536"/>
+            <w:tcBorders>
+              <w:top w:val="single" w:color="000000" w:sz="4"/>
+              <w:left w:val="single" w:color="000000" w:sz="4"/>
+              <w:bottom w:val="single" w:color="000000" w:sz="4"/>
+              <w:right w:val="single" w:color="000000" w:sz="4"/>
+            </w:tcBorders>
+            <w:tcMar>
+              <w:top w:type="dxa" w:w="60"/>
+              <w:left w:type="dxa" w:w="100"/>
+              <w:bottom w:type="dxa" w:w="60"/>
+              <w:right w:type="dxa" w:w="100"/>
+            </w:tcMar>
+            <w:vAlign w:val="center"/>
+          </w:tcPr>
+          <w:p>
+            <w:pPr>
+              <w:spacing w:after="20" w:line="240"/>
+              <w:jc w:val="left"/>
+            </w:pPr>
+            <w:r>
+              <w:rPr>
+                <w:sz w:val="20"/>
+                <w:szCs w:val="20"/>
+              </w:rPr>
+              <w:t xml:space="preserve">Implementada a troca de pombo entre fases (RF15 e HU16): ao liberar um pombo, o jogador escolhe seguir com o atual ou voar com o novo, sem recomeçar a noite.</w:t>
+            </w:r>
+          </w:p>
+        </w:tc>
+      </w:tr>
+    </w:tbl>
+    <w:p>
+      <w:pPr>
+        <w:spacing w:after="240" w:before="80" w:line="240"/>
+        <w:jc w:val="center"/>
+      </w:pPr>
+      <w:r>
+        <w:rPr>
+          <w:sz w:val="20"/>
+          <w:szCs w:val="20"/>
+        </w:rPr>
+        <w:t xml:space="preserve">Fonte: elaborado pelos autores (2026), a partir das mensagens dos testadores.</w:t>
       </w:r>
     </w:p>
     <w:p>
@@ -22427,7 +23892,7 @@
         <w:jc w:val="both"/>
       </w:pPr>
       <w:r>
-        <w:t xml:space="preserve">O jogo ainda não passou por um teste de usabilidade formal com pessoas de fora do grupo. O robô de teste confirma que o jogo funciona e pode ser vencido, mas não mede se ele é fácil de aprender.</w:t>
+        <w:t xml:space="preserve">O teste com pessoas de fora do grupo foi informal, com dois jogadores e sem medições. O robô de teste confirma que o jogo funciona e pode ser vencido, mas não mede se ele é fácil de aprender.</w:t>
       </w:r>
     </w:p>
     <w:p>
@@ -22441,7 +23906,7 @@
         <w:jc w:val="both"/>
       </w:pPr>
       <w:r>
-        <w:t xml:space="preserve">Os sons e as músicas são sintetizados por código, com timbres simples.</w:t>
+        <w:t xml:space="preserve">A versão web repete a lógica do jogo em JavaScript; uma mudança de regra precisa ser feita nos dois lugares.</w:t>
       </w:r>
     </w:p>
     <w:p>
@@ -22455,7 +23920,7 @@
         <w:jc w:val="both"/>
       </w:pPr>
       <w:r>
-        <w:t xml:space="preserve">A versão web repete a lógica do jogo em JavaScript; uma mudança de regra precisa ser feita nos dois lugares.</w:t>
+        <w:t xml:space="preserve">Os sons e as músicas são sintetizados por código, com timbres simples.</w:t>
       </w:r>
     </w:p>
     <w:p>
@@ -22479,7 +23944,7 @@
         <w:jc w:val="both"/>
       </w:pPr>
       <w:r>
-        <w:t xml:space="preserve">Fazer um teste de usabilidade com colegas, medindo tempo até a primeira entrega e erros mais comuns.</w:t>
+        <w:t xml:space="preserve">Fazer um teste de usabilidade mais amplo com colegas, medindo tempo até a primeira entrega e erros mais comuns.</w:t>
       </w:r>
     </w:p>
     <w:p>
@@ -22493,7 +23958,7 @@
         <w:jc w:val="both"/>
       </w:pPr>
       <w:r>
-        <w:t xml:space="preserve">Acrescentar modo para dois jogadores no mesmo teclado.</w:t>
+        <w:t xml:space="preserve">Avaliar, com mais testes, se jogadores iniciantes precisam de ajuda extra na fase 2, como um nível ainda mais fácil.</w:t>
       </w:r>
     </w:p>
     <w:p>
@@ -22507,7 +23972,7 @@
         <w:jc w:val="both"/>
       </w:pPr>
       <w:r>
-        <w:t xml:space="preserve">Oferecer opção de cores para daltonismo, já que fios ligados e desligados se diferenciam principalmente pela cor.</w:t>
+        <w:t xml:space="preserve">Unificar as regras das duas versões num arquivo de configuração compartilhado.</w:t>
       </w:r>
     </w:p>
     <w:p>
@@ -22521,7 +23986,7 @@
         <w:jc w:val="both"/>
       </w:pPr>
       <w:r>
-        <w:t xml:space="preserve">Aceitar controle de videogame.</w:t>
+        <w:t xml:space="preserve">Acrescentar modo para dois jogadores no mesmo teclado.</w:t>
       </w:r>
     </w:p>
     <w:p>
@@ -22535,7 +24000,21 @@
         <w:jc w:val="both"/>
       </w:pPr>
       <w:r>
-        <w:t xml:space="preserve">Unificar as regras das duas versões num arquivo de configuração compartilhado.</w:t>
+        <w:t xml:space="preserve">Oferecer opção de cores para daltonismo, já que fios ligados e desligados se diferenciam principalmente pela cor.</w:t>
+      </w:r>
+    </w:p>
+    <w:p>
+      <w:pPr>
+        <w:pStyle w:val="ListParagraph"/>
+        <w:numPr>
+          <w:ilvl w:val="0"/>
+          <w:numId w:val="2"/>
+        </w:numPr>
+        <w:spacing w:after="60" w:line="360"/>
+        <w:jc w:val="both"/>
+      </w:pPr>
+      <w:r>
+        <w:t xml:space="preserve">Aceitar controle de videogame.</w:t>
       </w:r>
     </w:p>
     <w:p>
@@ -22555,7 +24034,7 @@
         <w:jc w:val="both"/>
       </w:pPr>
       <w:r>
-        <w:t xml:space="preserve">O grupo utilizou a ferramenta Claude (Anthropic) para gerar a primeira versão do código do jogo, dos scripts de geração de sprites, sons e músicas, da versão web, do README e deste documento, além de propor a ideia do jogo e o rascunho da história, que foram escolhidos e ajustados pelo grupo. A ferramenta também criou o robô de teste usado no capítulo 6. A declaração completa, com a lista de arquivos, está no README do projeto, conforme exige o enunciado. Todo o código foi revisado e estudado pelo grupo com o apoio do guia em docs/GUIA</w:t>
+        <w:t xml:space="preserve">O grupo utilizou a ferramenta Claude (Anthropic) para gerar a primeira versão do código do jogo, dos scripts de geração de sprites, sons e músicas, da versão web e do ícone, do README e deste documento, além de propor a ideia do jogo e o rascunho da história, que foram escolhidos e ajustados pelo grupo. A ferramenta também criou o robô de teste usado no capítulo 6. A declaração completa, com a lista de arquivos, está no README do projeto, conforme exige o enunciado. Todo o código foi revisado e estudado pelo grupo com o apoio do guia em docs/GUIA</w:t>
       </w:r>
       <w:r>
         <w:rPr>

</xml_diff>

<commit_message>
Opção de zerar o progresso dos pombos
</commit_message>
<xml_diff>
--- a/correio-noturno/docs/Documentacao_Software_Correio_Noturno.docx
+++ b/correio-noturno/docs/Documentacao_Software_Correio_Noturno.docx
@@ -5084,7 +5084,7 @@
                 <w:sz w:val="20"/>
                 <w:szCs w:val="20"/>
               </w:rPr>
-              <w:t xml:space="preserve">Disponibilizar uma versão web jogável no celular, com controle por toque e ícone próprio para a tela de início.</w:t>
+              <w:t xml:space="preserve">Permitir zerar o progresso em Opções, com confirmação, deixando só o Bico liberado e mantendo recordes e opções.</w:t>
             </w:r>
           </w:p>
         </w:tc>
@@ -5146,7 +5146,7 @@
                 <w:sz w:val="20"/>
                 <w:szCs w:val="20"/>
               </w:rPr>
-              <w:t xml:space="preserve">UC01 a UC14</w:t>
+              <w:t xml:space="preserve">UC11</w:t>
             </w:r>
           </w:p>
         </w:tc>
@@ -5183,6 +5183,135 @@
                 <w:szCs w:val="20"/>
               </w:rPr>
               <w:t xml:space="preserve">RF26</w:t>
+            </w:r>
+          </w:p>
+        </w:tc>
+        <w:tc>
+          <w:tcPr>
+            <w:tcW w:type="dxa" w:w="5474"/>
+            <w:tcBorders>
+              <w:top w:val="single" w:color="000000" w:sz="4"/>
+              <w:left w:val="single" w:color="000000" w:sz="4"/>
+              <w:bottom w:val="single" w:color="000000" w:sz="4"/>
+              <w:right w:val="single" w:color="000000" w:sz="4"/>
+            </w:tcBorders>
+            <w:tcMar>
+              <w:top w:type="dxa" w:w="60"/>
+              <w:left w:type="dxa" w:w="100"/>
+              <w:bottom w:type="dxa" w:w="60"/>
+              <w:right w:type="dxa" w:w="100"/>
+            </w:tcMar>
+            <w:vAlign w:val="center"/>
+          </w:tcPr>
+          <w:p>
+            <w:pPr>
+              <w:spacing w:after="20" w:line="240"/>
+              <w:jc w:val="left"/>
+            </w:pPr>
+            <w:r>
+              <w:rPr>
+                <w:sz w:val="20"/>
+                <w:szCs w:val="20"/>
+              </w:rPr>
+              <w:t xml:space="preserve">Disponibilizar uma versão web jogável no celular, com controle por toque e ícone próprio para a tela de início.</w:t>
+            </w:r>
+          </w:p>
+        </w:tc>
+        <w:tc>
+          <w:tcPr>
+            <w:tcW w:type="dxa" w:w="1251"/>
+            <w:tcBorders>
+              <w:top w:val="single" w:color="000000" w:sz="4"/>
+              <w:left w:val="single" w:color="000000" w:sz="4"/>
+              <w:bottom w:val="single" w:color="000000" w:sz="4"/>
+              <w:right w:val="single" w:color="000000" w:sz="4"/>
+            </w:tcBorders>
+            <w:tcMar>
+              <w:top w:type="dxa" w:w="60"/>
+              <w:left w:type="dxa" w:w="100"/>
+              <w:bottom w:type="dxa" w:w="60"/>
+              <w:right w:type="dxa" w:w="100"/>
+            </w:tcMar>
+            <w:vAlign w:val="center"/>
+          </w:tcPr>
+          <w:p>
+            <w:pPr>
+              <w:spacing w:after="20" w:line="240"/>
+              <w:jc w:val="center"/>
+            </w:pPr>
+            <w:r>
+              <w:rPr>
+                <w:sz w:val="20"/>
+                <w:szCs w:val="20"/>
+              </w:rPr>
+              <w:t xml:space="preserve">Could</w:t>
+            </w:r>
+          </w:p>
+        </w:tc>
+        <w:tc>
+          <w:tcPr>
+            <w:tcW w:type="dxa" w:w="1565"/>
+            <w:tcBorders>
+              <w:top w:val="single" w:color="000000" w:sz="4"/>
+              <w:left w:val="single" w:color="000000" w:sz="4"/>
+              <w:bottom w:val="single" w:color="000000" w:sz="4"/>
+              <w:right w:val="single" w:color="000000" w:sz="4"/>
+            </w:tcBorders>
+            <w:tcMar>
+              <w:top w:type="dxa" w:w="60"/>
+              <w:left w:type="dxa" w:w="100"/>
+              <w:bottom w:type="dxa" w:w="60"/>
+              <w:right w:type="dxa" w:w="100"/>
+            </w:tcMar>
+            <w:vAlign w:val="center"/>
+          </w:tcPr>
+          <w:p>
+            <w:pPr>
+              <w:spacing w:after="20" w:line="240"/>
+              <w:jc w:val="left"/>
+            </w:pPr>
+            <w:r>
+              <w:rPr>
+                <w:sz w:val="20"/>
+                <w:szCs w:val="20"/>
+              </w:rPr>
+              <w:t xml:space="preserve">UC01 a UC14</w:t>
+            </w:r>
+          </w:p>
+        </w:tc>
+      </w:tr>
+      <w:tr>
+        <w:trPr>
+          <w:cantSplit/>
+        </w:trPr>
+        <w:tc>
+          <w:tcPr>
+            <w:tcW w:type="dxa" w:w="782"/>
+            <w:tcBorders>
+              <w:top w:val="single" w:color="000000" w:sz="4"/>
+              <w:left w:val="single" w:color="000000" w:sz="4"/>
+              <w:bottom w:val="single" w:color="000000" w:sz="4"/>
+              <w:right w:val="single" w:color="000000" w:sz="4"/>
+            </w:tcBorders>
+            <w:tcMar>
+              <w:top w:type="dxa" w:w="60"/>
+              <w:left w:type="dxa" w:w="100"/>
+              <w:bottom w:type="dxa" w:w="60"/>
+              <w:right w:type="dxa" w:w="100"/>
+            </w:tcMar>
+            <w:vAlign w:val="center"/>
+          </w:tcPr>
+          <w:p>
+            <w:pPr>
+              <w:spacing w:after="20" w:line="240"/>
+              <w:jc w:val="center"/>
+            </w:pPr>
+            <w:r>
+              <w:rPr>
+                <w:sz w:val="20"/>
+                <w:szCs w:val="20"/>
+              </w:rPr>
+              <w:t xml:space="preserve">RF27</w:t>
             </w:r>
           </w:p>
         </w:tc>
@@ -12201,7 +12330,7 @@
                 <w:sz w:val="20"/>
                 <w:szCs w:val="20"/>
               </w:rPr>
-              <w:t xml:space="preserve">Pausa a qualquer momento, reinício sem fechar o programa, Esc para pular a história e voltar de qualquer tela; cartas derrubadas ao levar dano podem ser recolhidas de novo.</w:t>
+              <w:t xml:space="preserve">Pausa a qualquer momento, reinício sem fechar o programa, Esc para pular a história e voltar de qualquer tela; cartas derrubadas ao levar dano podem ser recolhidas de novo; troca de pombo ao liberar um novo; opção de zerar o progresso para recomeçar a liberar os pombos.</w:t>
             </w:r>
           </w:p>
         </w:tc>
@@ -12335,7 +12464,7 @@
                 <w:sz w:val="20"/>
                 <w:szCs w:val="20"/>
               </w:rPr>
-              <w:t xml:space="preserve">Avisos antes de cada perigo ("!" do gato, aviso de vento, fio que pisca antes de religar); tempo de invencibilidade depois do dano; pausa automática ao trocar de janela.</w:t>
+              <w:t xml:space="preserve">Avisos antes de cada perigo ("!" do gato, aviso de vento, fio que pisca antes de religar); tempo de invencibilidade depois do dano; pausa automática ao trocar de janela; zerar o progresso só acontece depois de uma confirmação, com aviso do que será apagado.</w:t>
             </w:r>
           </w:p>
         </w:tc>
@@ -15012,6 +15141,135 @@
           </w:p>
         </w:tc>
       </w:tr>
+      <w:tr>
+        <w:trPr>
+          <w:cantSplit/>
+        </w:trPr>
+        <w:tc>
+          <w:tcPr>
+            <w:tcW w:type="dxa" w:w="889"/>
+            <w:tcBorders>
+              <w:top w:val="single" w:color="000000" w:sz="4"/>
+              <w:left w:val="single" w:color="000000" w:sz="4"/>
+              <w:bottom w:val="single" w:color="000000" w:sz="4"/>
+              <w:right w:val="single" w:color="000000" w:sz="4"/>
+            </w:tcBorders>
+            <w:tcMar>
+              <w:top w:type="dxa" w:w="60"/>
+              <w:left w:type="dxa" w:w="100"/>
+              <w:bottom w:type="dxa" w:w="60"/>
+              <w:right w:type="dxa" w:w="100"/>
+            </w:tcMar>
+            <w:vAlign w:val="center"/>
+          </w:tcPr>
+          <w:p>
+            <w:pPr>
+              <w:spacing w:after="20" w:line="240"/>
+              <w:jc w:val="center"/>
+            </w:pPr>
+            <w:r>
+              <w:rPr>
+                <w:sz w:val="20"/>
+                <w:szCs w:val="20"/>
+              </w:rPr>
+              <w:t xml:space="preserve">HU17</w:t>
+            </w:r>
+          </w:p>
+        </w:tc>
+        <w:tc>
+          <w:tcPr>
+            <w:tcW w:type="dxa" w:w="3735"/>
+            <w:tcBorders>
+              <w:top w:val="single" w:color="000000" w:sz="4"/>
+              <w:left w:val="single" w:color="000000" w:sz="4"/>
+              <w:bottom w:val="single" w:color="000000" w:sz="4"/>
+              <w:right w:val="single" w:color="000000" w:sz="4"/>
+            </w:tcBorders>
+            <w:tcMar>
+              <w:top w:type="dxa" w:w="60"/>
+              <w:left w:type="dxa" w:w="100"/>
+              <w:bottom w:type="dxa" w:w="60"/>
+              <w:right w:type="dxa" w:w="100"/>
+            </w:tcMar>
+            <w:vAlign w:val="center"/>
+          </w:tcPr>
+          <w:p>
+            <w:pPr>
+              <w:spacing w:after="20" w:line="240"/>
+              <w:jc w:val="left"/>
+            </w:pPr>
+            <w:r>
+              <w:rPr>
+                <w:sz w:val="20"/>
+                <w:szCs w:val="20"/>
+              </w:rPr>
+              <w:t xml:space="preserve">Como jogador, quero zerar meu progresso para liberar os pombos de novo desde o começo.</w:t>
+            </w:r>
+          </w:p>
+        </w:tc>
+        <w:tc>
+          <w:tcPr>
+            <w:tcW w:type="dxa" w:w="889"/>
+            <w:tcBorders>
+              <w:top w:val="single" w:color="000000" w:sz="4"/>
+              <w:left w:val="single" w:color="000000" w:sz="4"/>
+              <w:bottom w:val="single" w:color="000000" w:sz="4"/>
+              <w:right w:val="single" w:color="000000" w:sz="4"/>
+            </w:tcBorders>
+            <w:tcMar>
+              <w:top w:type="dxa" w:w="60"/>
+              <w:left w:type="dxa" w:w="100"/>
+              <w:bottom w:type="dxa" w:w="60"/>
+              <w:right w:type="dxa" w:w="100"/>
+            </w:tcMar>
+            <w:vAlign w:val="center"/>
+          </w:tcPr>
+          <w:p>
+            <w:pPr>
+              <w:spacing w:after="20" w:line="240"/>
+              <w:jc w:val="center"/>
+            </w:pPr>
+            <w:r>
+              <w:rPr>
+                <w:sz w:val="20"/>
+                <w:szCs w:val="20"/>
+              </w:rPr>
+              <w:t xml:space="preserve">2</w:t>
+            </w:r>
+          </w:p>
+        </w:tc>
+        <w:tc>
+          <w:tcPr>
+            <w:tcW w:type="dxa" w:w="3559"/>
+            <w:tcBorders>
+              <w:top w:val="single" w:color="000000" w:sz="4"/>
+              <w:left w:val="single" w:color="000000" w:sz="4"/>
+              <w:bottom w:val="single" w:color="000000" w:sz="4"/>
+              <w:right w:val="single" w:color="000000" w:sz="4"/>
+            </w:tcBorders>
+            <w:tcMar>
+              <w:top w:type="dxa" w:w="60"/>
+              <w:left w:type="dxa" w:w="100"/>
+              <w:bottom w:type="dxa" w:w="60"/>
+              <w:right w:type="dxa" w:w="100"/>
+            </w:tcMar>
+            <w:vAlign w:val="center"/>
+          </w:tcPr>
+          <w:p>
+            <w:pPr>
+              <w:spacing w:after="20" w:line="240"/>
+              <w:jc w:val="left"/>
+            </w:pPr>
+            <w:r>
+              <w:rPr>
+                <w:sz w:val="20"/>
+                <w:szCs w:val="20"/>
+              </w:rPr>
+              <w:t xml:space="preserve">Opção em Opções que pede confirmação; depois dela só o Bico fica liberado; recordes e opções não são apagados.</w:t>
+            </w:r>
+          </w:p>
+        </w:tc>
+      </w:tr>
     </w:tbl>
     <w:p>
       <w:pPr>
@@ -15819,7 +16077,7 @@
                 <w:sz w:val="20"/>
                 <w:szCs w:val="20"/>
               </w:rPr>
-              <w:t xml:space="preserve">HU14, HU16</w:t>
+              <w:t xml:space="preserve">HU14, HU16, HU17</w:t>
             </w:r>
           </w:p>
         </w:tc>
@@ -15850,7 +16108,7 @@
                 <w:sz w:val="20"/>
                 <w:szCs w:val="20"/>
               </w:rPr>
-              <w:t xml:space="preserve">Teste com jogadores de fora do grupo, troca de pombo entre fases (surgida desse teste), testes em outros computadores, ajustes finais, README, documentação de software, publicação no GitHub e ensaio da apresentação.</w:t>
+              <w:t xml:space="preserve">Teste com jogadores de fora do grupo, troca de pombo entre fases (surgida desse teste), opção de zerar o progresso, testes em outros computadores, ajustes finais, README, documentação de software, publicação no GitHub e ensaio da apresentação.</w:t>
             </w:r>
           </w:p>
         </w:tc>
@@ -15876,7 +16134,7 @@
         <w:jc w:val="both"/>
       </w:pPr>
       <w:r>
-        <w:t xml:space="preserve">No total, o backlog soma 73 pontos, distribuídos em cinco sprints (18, 21, 14, 14 e 6 pontos). As duas primeiras cuidam do que o jogo precisa para funcionar: controle, entregas, HUD, perigos e fases. As duas seguintes acrescentam a história, os personagens, os recordes e as opções. A quarta também leva o jogo para o celular. A última fica reservada para testes com usuários, correções, documentação e preparação da apresentação; a troca de pombo entrou nela porque nasceu do teste descrito na seção 6.4.</w:t>
+        <w:t xml:space="preserve">No total, o backlog soma 75 pontos, distribuídos em cinco sprints (18, 21, 14, 14 e 8 pontos). As duas primeiras cuidam do que o jogo precisa para funcionar: controle, entregas, HUD, perigos e fases. As duas seguintes acrescentam a história, os personagens, os recordes e as opções. A quarta também leva o jogo para o celular. A última fica reservada para testes com usuários, correções, documentação e preparação da apresentação; a troca de pombo entrou nela porque nasceu do teste descrito na seção 6.4, e a opção de zerar o progresso veio logo depois, para quem quiser liberar os pombos de novo.</w:t>
       </w:r>
     </w:p>
     <w:p>
@@ -22956,7 +23214,7 @@
                 <w:sz w:val="20"/>
                 <w:szCs w:val="20"/>
               </w:rPr>
-              <w:t xml:space="preserve">Abrir a versão web num celular simulado e jogar com toque.</w:t>
+              <w:t xml:space="preserve">Em Opções, escolher Zerar progresso uma vez e depois confirmar.</w:t>
             </w:r>
           </w:p>
         </w:tc>
@@ -22987,7 +23245,7 @@
                 <w:sz w:val="20"/>
                 <w:szCs w:val="20"/>
               </w:rPr>
-              <w:t xml:space="preserve">Botões respondem, o joystick move o pombo e não há erros no console.</w:t>
+              <w:t xml:space="preserve">Na primeira vez só aparece o aviso; ao confirmar, só o Bico fica liberado e os recordes continuam na tela Recordes.</w:t>
             </w:r>
           </w:p>
         </w:tc>
@@ -23085,7 +23343,7 @@
                 <w:sz w:val="20"/>
                 <w:szCs w:val="20"/>
               </w:rPr>
-              <w:t xml:space="preserve">Adicionar a versão web à tela de início de um iPhone pelo Safari.</w:t>
+              <w:t xml:space="preserve">Abrir a versão web num celular simulado e jogar com toque.</w:t>
             </w:r>
           </w:p>
         </w:tc>
@@ -23116,7 +23374,7 @@
                 <w:sz w:val="20"/>
                 <w:szCs w:val="20"/>
               </w:rPr>
-              <w:t xml:space="preserve">O atalho aparece com o ícone e o nome Correio Noturno e abre o jogo em tela cheia.</w:t>
+              <w:t xml:space="preserve">Botões respondem, o joystick move o pombo e não há erros no console.</w:t>
             </w:r>
           </w:p>
         </w:tc>
@@ -23147,7 +23405,7 @@
                 <w:sz w:val="20"/>
                 <w:szCs w:val="20"/>
               </w:rPr>
-              <w:t xml:space="preserve">A verificar pelo grupo</w:t>
+              <w:t xml:space="preserve">Aprovado</w:t>
             </w:r>
           </w:p>
         </w:tc>
@@ -23214,7 +23472,7 @@
                 <w:sz w:val="20"/>
                 <w:szCs w:val="20"/>
               </w:rPr>
-              <w:t xml:space="preserve">Conferir volume e equilíbrio de música e efeitos com fone de ouvido.</w:t>
+              <w:t xml:space="preserve">Adicionar a versão web à tela de início de um iPhone pelo Safari.</w:t>
             </w:r>
           </w:p>
         </w:tc>
@@ -23245,7 +23503,7 @@
                 <w:sz w:val="20"/>
                 <w:szCs w:val="20"/>
               </w:rPr>
-              <w:t xml:space="preserve">Música e efeitos audíveis, sem um encobrir o outro.</w:t>
+              <w:t xml:space="preserve">O atalho aparece com o ícone e o nome Correio Noturno e abre o jogo em tela cheia.</w:t>
             </w:r>
           </w:p>
         </w:tc>
@@ -23343,6 +23601,135 @@
                 <w:sz w:val="20"/>
                 <w:szCs w:val="20"/>
               </w:rPr>
+              <w:t xml:space="preserve">Conferir volume e equilíbrio de música e efeitos com fone de ouvido.</w:t>
+            </w:r>
+          </w:p>
+        </w:tc>
+        <w:tc>
+          <w:tcPr>
+            <w:tcW w:type="dxa" w:w="3265"/>
+            <w:tcBorders>
+              <w:top w:val="single" w:color="000000" w:sz="4"/>
+              <w:left w:val="single" w:color="000000" w:sz="4"/>
+              <w:bottom w:val="single" w:color="000000" w:sz="4"/>
+              <w:right w:val="single" w:color="000000" w:sz="4"/>
+            </w:tcBorders>
+            <w:tcMar>
+              <w:top w:type="dxa" w:w="60"/>
+              <w:left w:type="dxa" w:w="100"/>
+              <w:bottom w:type="dxa" w:w="60"/>
+              <w:right w:type="dxa" w:w="100"/>
+            </w:tcMar>
+            <w:vAlign w:val="center"/>
+          </w:tcPr>
+          <w:p>
+            <w:pPr>
+              <w:spacing w:after="20" w:line="240"/>
+              <w:jc w:val="left"/>
+            </w:pPr>
+            <w:r>
+              <w:rPr>
+                <w:sz w:val="20"/>
+                <w:szCs w:val="20"/>
+              </w:rPr>
+              <w:t xml:space="preserve">Música e efeitos audíveis, sem um encobrir o outro.</w:t>
+            </w:r>
+          </w:p>
+        </w:tc>
+        <w:tc>
+          <w:tcPr>
+            <w:tcW w:type="dxa" w:w="1635"/>
+            <w:tcBorders>
+              <w:top w:val="single" w:color="000000" w:sz="4"/>
+              <w:left w:val="single" w:color="000000" w:sz="4"/>
+              <w:bottom w:val="single" w:color="000000" w:sz="4"/>
+              <w:right w:val="single" w:color="000000" w:sz="4"/>
+            </w:tcBorders>
+            <w:tcMar>
+              <w:top w:type="dxa" w:w="60"/>
+              <w:left w:type="dxa" w:w="100"/>
+              <w:bottom w:type="dxa" w:w="60"/>
+              <w:right w:type="dxa" w:w="100"/>
+            </w:tcMar>
+            <w:vAlign w:val="center"/>
+          </w:tcPr>
+          <w:p>
+            <w:pPr>
+              <w:spacing w:after="20" w:line="240"/>
+              <w:jc w:val="center"/>
+            </w:pPr>
+            <w:r>
+              <w:rPr>
+                <w:sz w:val="20"/>
+                <w:szCs w:val="20"/>
+              </w:rPr>
+              <w:t xml:space="preserve">A verificar pelo grupo</w:t>
+            </w:r>
+          </w:p>
+        </w:tc>
+      </w:tr>
+      <w:tr>
+        <w:trPr>
+          <w:cantSplit/>
+        </w:trPr>
+        <w:tc>
+          <w:tcPr>
+            <w:tcW w:type="dxa" w:w="907"/>
+            <w:tcBorders>
+              <w:top w:val="single" w:color="000000" w:sz="4"/>
+              <w:left w:val="single" w:color="000000" w:sz="4"/>
+              <w:bottom w:val="single" w:color="000000" w:sz="4"/>
+              <w:right w:val="single" w:color="000000" w:sz="4"/>
+            </w:tcBorders>
+            <w:tcMar>
+              <w:top w:type="dxa" w:w="60"/>
+              <w:left w:type="dxa" w:w="100"/>
+              <w:bottom w:type="dxa" w:w="60"/>
+              <w:right w:type="dxa" w:w="100"/>
+            </w:tcMar>
+            <w:vAlign w:val="center"/>
+          </w:tcPr>
+          <w:p>
+            <w:pPr>
+              <w:spacing w:after="20" w:line="240"/>
+              <w:jc w:val="center"/>
+            </w:pPr>
+            <w:r>
+              <w:rPr>
+                <w:sz w:val="20"/>
+                <w:szCs w:val="20"/>
+              </w:rPr>
+              <w:t xml:space="preserve">CT16</w:t>
+            </w:r>
+          </w:p>
+        </w:tc>
+        <w:tc>
+          <w:tcPr>
+            <w:tcW w:type="dxa" w:w="3265"/>
+            <w:tcBorders>
+              <w:top w:val="single" w:color="000000" w:sz="4"/>
+              <w:left w:val="single" w:color="000000" w:sz="4"/>
+              <w:bottom w:val="single" w:color="000000" w:sz="4"/>
+              <w:right w:val="single" w:color="000000" w:sz="4"/>
+            </w:tcBorders>
+            <w:tcMar>
+              <w:top w:type="dxa" w:w="60"/>
+              <w:left w:type="dxa" w:w="100"/>
+              <w:bottom w:type="dxa" w:w="60"/>
+              <w:right w:type="dxa" w:w="100"/>
+            </w:tcMar>
+            <w:vAlign w:val="center"/>
+          </w:tcPr>
+          <w:p>
+            <w:pPr>
+              <w:spacing w:after="20" w:line="240"/>
+              <w:jc w:val="left"/>
+            </w:pPr>
+            <w:r>
+              <w:rPr>
+                <w:sz w:val="20"/>
+                <w:szCs w:val="20"/>
+              </w:rPr>
               <w:t xml:space="preserve">Rodar o jogo em outro computador do grupo (Windows).</w:t>
             </w:r>
           </w:p>
@@ -23431,7 +23818,7 @@
         <w:jc w:val="both"/>
       </w:pPr>
       <w:r>
-        <w:t xml:space="preserve">Os casos CT13, CT14 e CT15 dependem de equipamento real: o robô não tem um iPhone nem placa de som, e o enunciado pede explicitamente que as instruções sejam testadas em outro computador.</w:t>
+        <w:t xml:space="preserve">Os casos CT14, CT15 e CT16 dependem de equipamento real: o robô não tem um iPhone nem placa de som, e o enunciado pede explicitamente que as instruções sejam testadas em outro computador.</w:t>
       </w:r>
     </w:p>
     <w:p>

</xml_diff>